<commit_message>
[WS3] Add Appendix C: Source code, repo tree, quickstart and locator table
</commit_message>
<xml_diff>
--- a/WS/workstream03/BAO_CAO_WORKSTREAM_3_LAIGIAHUY.docx
+++ b/WS/workstream03/BAO_CAO_WORKSTREAM_3_LAIGIAHUY.docx
@@ -4,36 +4,7 @@
   <w:body>
     <w:p>
       <w:pPr>
-        <w:spacing w:after="40"/>
-        <w:jc w:val="center"/>
-      </w:pPr>
-      <w:r>
-        <w:rPr>
-          <w:rFonts w:ascii="Times New Roman" w:hAnsi="Times New Roman"/>
-          <w:b/>
-          <w:color w:val="2C3E50"/>
-          <w:sz w:val="24"/>
-        </w:rPr>
-        <w:t>TRƯỜNG ĐẠI HỌC KINH TẾ - LUẬT | ĐHQG-HCM</w:t>
-      </w:r>
-    </w:p>
-    <w:p>
-      <w:pPr>
-        <w:spacing w:after="320"/>
-        <w:jc w:val="center"/>
-      </w:pPr>
-      <w:r>
-        <w:rPr>
-          <w:rFonts w:ascii="Times New Roman" w:hAnsi="Times New Roman"/>
-          <w:color w:val="2980B9"/>
-          <w:sz w:val="22"/>
-        </w:rPr>
-        <w:t>HỌC PHẦN: VẬN TRÙ HỌC (OPERATIONS RESEARCH)</w:t>
-      </w:r>
-    </w:p>
-    <w:p>
-      <w:pPr>
-        <w:spacing w:after="160"/>
+        <w:spacing w:before="0" w:after="80"/>
         <w:jc w:val="center"/>
       </w:pPr>
       <w:r>
@@ -43,9 +14,9 @@
           <w:color w:val="182B49"/>
           <w:sz w:val="32"/>
         </w:rPr>
-        <w:t>BÁO CÁO KỸ THUẬT WORKSTREAM 3: DATA ENGINEERING</w:t>
+        <w:t>BÁO CÁO KHOA HỌC WORKSTREAM 3: DATA ENGINEERING</w:t>
         <w:br/>
-        <w:t>TIỀN XỬ LÝ VÀ XÂY DỰNG DỮ LIỆU ĐỊNH TUYẾN TỐI ƯU</w:t>
+        <w:t>VÀ PHỤ LỤC C — MÃ NGUỒN &amp; KHO LƯU TRỮ HỆ THỐNG</w:t>
       </w:r>
     </w:p>
     <w:p>
@@ -58,31 +29,13 @@
           <w:rFonts w:ascii="Times New Roman" w:hAnsi="Times New Roman"/>
           <w:i/>
           <w:color w:val="2C3E50"/>
-          <w:sz w:val="23"/>
-        </w:rPr>
-        <w:t>Đề tài: Chủ đề 5 (Mức độ C) – Mối liên hệ giữa bài toán đường đi ngắn nhất và machine learning / routing hiện đại</w:t>
-      </w:r>
-    </w:p>
-    <w:p>
-      <w:pPr>
-        <w:spacing w:after="400"/>
-        <w:jc w:val="center"/>
-      </w:pPr>
-      <w:r>
-        <w:rPr>
-          <w:rFonts w:ascii="Times New Roman" w:hAnsi="Times New Roman"/>
-          <w:b/>
-          <w:color w:val="2C3E50"/>
           <w:sz w:val="22"/>
         </w:rPr>
-        <w:t>Sinh viên thực hiện: LẠI GIA HUY | MSSV: K24419</w:t>
+        <w:t>Đề tài: Mối liên hệ giữa bài toán đường đi ngắn nhất và machine learning / routing hiện đại</w:t>
         <w:br/>
-        <w:t>Nhóm nghiên cứu: Nhóm 5 – RCSP Routing Team</w:t>
-      </w:r>
-    </w:p>
-    <w:p>
-      <w:r>
-        <w:br w:type="page"/>
+        <w:t>Chủ đề 5 (Mức độ C) — Trường Đại học Kinh tế - Luật (UEL / ĐHQG-HCM)</w:t>
+        <w:br/>
+        <w:t>Sinh viên phụ trách WS3: LẠI GIA HUY — MSSV: K24419</w:t>
       </w:r>
     </w:p>
     <w:p>
@@ -97,7 +50,7 @@
           <w:color w:val="182B49"/>
           <w:sz w:val="30"/>
         </w:rPr>
-        <w:t>PHẦN 1. NỘI DUNG 3 MỤC BÁO CÁO CHÍNH THỨC CỦA WORKSTREAM 3</w:t>
+        <w:t>I.3 Phạm vi nghiên cứu</w:t>
       </w:r>
     </w:p>
     <w:p>
@@ -107,10 +60,80 @@
       <w:r>
         <w:rPr>
           <w:rFonts w:ascii="Times New Roman" w:hAnsi="Times New Roman"/>
+          <w:sz w:val="22"/>
+        </w:rPr>
+        <w:t>Trong khuôn khổ Chủ đề 5 (Mức độ C), nghiên cứu được thiết kế với cấu trúc hai tầng mạng lưới nhằm đảm bảo tính toàn vẹn lý thuyết và khả năng mở rộng ứng dụng thực tiễn:</w:t>
+      </w:r>
+    </w:p>
+    <w:p>
+      <w:pPr>
+        <w:pStyle w:val="ListBullet"/>
+        <w:spacing w:before="20" w:after="60" w:line="276" w:lineRule="auto"/>
+      </w:pPr>
+      <w:r>
+        <w:rPr>
+          <w:rFonts w:ascii="Times New Roman" w:hAnsi="Times New Roman"/>
+          <w:b/>
           <w:color w:val="2C3E50"/>
           <w:sz w:val="22"/>
         </w:rPr>
-        <w:t>(Nội dung dưới đây được biên soạn chuẩn chỉ theo cấu trúc đề cương nhóm để dán trực tiếp vào Thẻ 'Tiểu luận' trên Google Docs chung).</w:t>
+        <w:t xml:space="preserve">Tầng 1 - </w:t>
+      </w:r>
+      <w:r>
+        <w:rPr>
+          <w:rFonts w:ascii="Times New Roman" w:hAnsi="Times New Roman"/>
+          <w:sz w:val="22"/>
+        </w:rPr>
+        <w:t xml:space="preserve"> Mạng giao thông Seervada Park (Lõi lý thuyết &amp; Dạy học): Mạng lưới giao thông chuẩn mực gồm 7 nút và 12 cạnh vô hướng (tương đương 24 cung có hướng). Bộ dữ liệu mô phỏng 30 ngày (1.800 quan sát) và 90 ngày (5.400 quan sát) phục vụ việc kiểm chứng thuật toán Dijkstra, giải bài toán đường đi ngắn nhất có ràng buộc tài nguyên (RCSP) và đánh giá độ chính xác của các mô hình dự báo thời gian di chuyển (Group Mean, Linear Regression, Neural Network MLP).</w:t>
+      </w:r>
+    </w:p>
+    <w:p>
+      <w:pPr>
+        <w:pStyle w:val="ListBullet"/>
+        <w:spacing w:before="20" w:after="60" w:line="276" w:lineRule="auto"/>
+      </w:pPr>
+      <w:r>
+        <w:rPr>
+          <w:rFonts w:ascii="Times New Roman" w:hAnsi="Times New Roman"/>
+          <w:b/>
+          <w:color w:val="2C3E50"/>
+          <w:sz w:val="22"/>
+        </w:rPr>
+        <w:t xml:space="preserve">Tầng 2 - </w:t>
+      </w:r>
+      <w:r>
+        <w:rPr>
+          <w:rFonts w:ascii="Times New Roman" w:hAnsi="Times New Roman"/>
+          <w:sz w:val="22"/>
+        </w:rPr>
+        <w:t xml:space="preserve"> Mạng giao thông thực tế PeMS-Bay California (Mở rộng quy mô thực tiễn): Trích xuất mạng con liên thông gồm 25 cảm biến và 139 cạnh định hướng từ hệ thống Performance Measurement System (PeMS) tại Vịnh San Francisco, California. Khoảng cách địa lý được tính toán chính xác bằng công thức Haversine (đơn vị km) từ tọa độ thực tế. Dữ liệu tốc độ 5 phút thực tế được làm sạch và chuyển đổi thành thời gian di chuyển (travel time), cung cấp cơ sở dữ liệu lớn để kiểm chứng tính bền vững của các mô hình học máy và giải thuật định tuyến thích nghi.</w:t>
+      </w:r>
+    </w:p>
+    <w:p>
+      <w:pPr>
+        <w:pStyle w:val="Heading1"/>
+        <w:spacing w:before="280" w:after="120"/>
+      </w:pPr>
+      <w:r>
+        <w:rPr>
+          <w:rFonts w:ascii="Times New Roman" w:hAnsi="Times New Roman"/>
+          <w:b/>
+          <w:color w:val="182B49"/>
+          <w:sz w:val="30"/>
+        </w:rPr>
+        <w:t>III.1 Dữ liệu nghiên cứu</w:t>
+      </w:r>
+    </w:p>
+    <w:p>
+      <w:pPr>
+        <w:spacing w:before="40" w:after="80" w:line="276" w:lineRule="auto"/>
+      </w:pPr>
+      <w:r>
+        <w:rPr>
+          <w:rFonts w:ascii="Times New Roman" w:hAnsi="Times New Roman"/>
+          <w:sz w:val="22"/>
+        </w:rPr>
+        <w:t>Toàn bộ dữ liệu của dự án được phân loại rành mạch theo nguồn gốc, mục đích sử dụng và các cam kết kỹ thuật:</w:t>
       </w:r>
     </w:p>
     <w:p>
@@ -125,25 +148,13 @@
           <w:color w:val="2980B9"/>
           <w:sz w:val="26"/>
         </w:rPr>
-        <w:t>I.3. Phạm vi nghiên cứu</w:t>
+        <w:t>1. Mạng Seervada Park và Dữ liệu mô phỏng</w:t>
       </w:r>
     </w:p>
     <w:p>
       <w:pPr>
-        <w:spacing w:before="40" w:after="80" w:line="276" w:lineRule="auto"/>
-      </w:pPr>
-      <w:r>
-        <w:rPr>
-          <w:rFonts w:ascii="Times New Roman" w:hAnsi="Times New Roman"/>
-          <w:color w:val="2C3E50"/>
-          <w:sz w:val="22"/>
-        </w:rPr>
-        <w:t>Bài tiểu luận tập trung nghiên cứu bài toán đường đi ngắn nhất tĩnh và động trong môi trường mạng giao thông, kết nối lý thuyết tối ưu hóa tổ hợp với các mô hình dự báo học máy. Phạm vi nghiên cứu được xác định rõ trên hai không gian mạng lưới:</w:t>
-      </w:r>
-    </w:p>
-    <w:p>
-      <w:pPr>
-        <w:spacing w:before="40" w:after="80" w:line="276" w:lineRule="auto"/>
+        <w:pStyle w:val="ListBullet"/>
+        <w:spacing w:before="20" w:after="60" w:line="276" w:lineRule="auto"/>
       </w:pPr>
       <w:r>
         <w:rPr>
@@ -152,20 +163,20 @@
           <w:color w:val="2C3E50"/>
           <w:sz w:val="22"/>
         </w:rPr>
-        <w:t>1. Không gian mạng cốt lõi (Core Seervada Network):</w:t>
+        <w:t xml:space="preserve">• </w:t>
       </w:r>
       <w:r>
         <w:rPr>
           <w:rFonts w:ascii="Times New Roman" w:hAnsi="Times New Roman"/>
-          <w:color w:val="2C3E50"/>
           <w:sz w:val="22"/>
         </w:rPr>
-        <w:t xml:space="preserve"> Sử dụng đồ thị vô hướng mạng công viên Seervada (Hillier &amp; Lieberman, 2015), bao gồm 7 đỉnh (O, A, B, C, D, E, T) và 12 cạnh kết nối trực tiếp. Nút nguồn được quy ước là O và nút đích là T. Dữ liệu thời gian di chuyển được khảo sát trong chu kỳ 30 ngày liên tục, mỗi ngày phân chia thành 5 khung giờ tác nghiệp cố định (S1: 06:00–08:00, S2: 08:00–10:00, S3: 10:00–12:00, S4: 12:00–14:00, S5: 14:00–16:00). Tổng quy mô quan sát là 1.800 điểm dữ liệu (30 ngày × 5 khung giờ × 12 cạnh). Không gian này phục vụ kiểm chứng thuật toán Dijkstra, mô hình QHTT 0-1 (RCSP với T_max = 18 phút) và hai mô hình hồi quy baseline (Group Mean, Linear Regression).</w:t>
+        <w:t>Bản RCSP dạy học (seervada_rcsp_teaching.csv): Gồm 12 cạnh với khoảng cách distance (km) và mức tiêu thụ tài nguyên time (phút). Dùng làm đầu vào chuẩn cho Workstream 2 giải bài toán RCSP bằng Quy hoạch tuyến tính nguyên 0-1 (MILP) và đối chiếu với Excel Solver.</w:t>
       </w:r>
     </w:p>
     <w:p>
       <w:pPr>
-        <w:spacing w:before="40" w:after="80" w:line="276" w:lineRule="auto"/>
+        <w:pStyle w:val="ListBullet"/>
+        <w:spacing w:before="20" w:after="60" w:line="276" w:lineRule="auto"/>
       </w:pPr>
       <w:r>
         <w:rPr>
@@ -174,15 +185,36 @@
           <w:color w:val="2C3E50"/>
           <w:sz w:val="22"/>
         </w:rPr>
-        <w:t>2. Không gian mở rộng thực tế (Real-world Expansion - PeMS-Bay Subnetwork):</w:t>
+        <w:t xml:space="preserve">• </w:t>
       </w:r>
       <w:r>
         <w:rPr>
           <w:rFonts w:ascii="Times New Roman" w:hAnsi="Times New Roman"/>
+          <w:sz w:val="22"/>
+        </w:rPr>
+        <w:t>Bộ dữ liệu mô phỏng 30 ngày (seervada_travel_time_SIMULATED.csv): 1.800 dòng dữ liệu mô phỏng theo phân phối Log-Normal (mu = 0, sigma = 0.12) có tính đến hệ số cao điểm và cuối tuần. Được phân chia thành tập Train (1.440 dòng - 80%) và tập Test (360 dòng - 20%) theo đúng trật tự thời gian.</w:t>
+      </w:r>
+    </w:p>
+    <w:p>
+      <w:pPr>
+        <w:pStyle w:val="ListBullet"/>
+        <w:spacing w:before="20" w:after="60" w:line="276" w:lineRule="auto"/>
+      </w:pPr>
+      <w:r>
+        <w:rPr>
+          <w:rFonts w:ascii="Times New Roman" w:hAnsi="Times New Roman"/>
+          <w:b/>
           <w:color w:val="2C3E50"/>
           <w:sz w:val="22"/>
         </w:rPr>
-        <w:t xml:space="preserve"> Theo yêu cầu Chủ đề 5 ở Mức độ C (yêu cầu tự thu thập, xử lý dữ liệu thực tế và mô hình hóa mở), tập dữ liệu mô phỏng Seervada tuy chuẩn mực về lý thuyết nhưng có quy mô hữu hạn, chưa đủ độ phức tạp để khai thác trọn vẹn ưu thế của các mô hình học sâu (Deep Neural Networks/MLP). Do đó, nhóm mở rộng nghiên cứu sang hệ thống cảm biến giao thông cao tốc PeMS-Bay (California) với 325 cảm biến vòng từ, trích xuất mạng con liên thông 25 trạm cảm biến và 139 cạnh để đánh giá tính thích ứng của pipeline kỹ thuật dữ liệu và khả năng mở rộng của mô hình tối ưu.</w:t>
+        <w:t xml:space="preserve">• </w:t>
+      </w:r>
+      <w:r>
+        <w:rPr>
+          <w:rFonts w:ascii="Times New Roman" w:hAnsi="Times New Roman"/>
+          <w:sz w:val="22"/>
+        </w:rPr>
+        <w:t>Bộ dữ liệu mở rộng 90 ngày (seervada_travel_time_EXTENDED_NN.csv): 5.400 dòng quan sát mô phỏng nhằm cung cấp không gian mẫu đủ lớn phục vụ huấn luyện mạng nơ-ron sâu (Neural Network).</w:t>
       </w:r>
     </w:p>
     <w:p>
@@ -197,7 +229,66 @@
           <w:color w:val="2980B9"/>
           <w:sz w:val="26"/>
         </w:rPr>
-        <w:t>III.1. Dữ liệu</w:t>
+        <w:t>2. Mạng cảm biến thực tế PeMS-Bay California</w:t>
+      </w:r>
+    </w:p>
+    <w:p>
+      <w:pPr>
+        <w:pStyle w:val="ListBullet"/>
+        <w:spacing w:before="20" w:after="60" w:line="276" w:lineRule="auto"/>
+      </w:pPr>
+      <w:r>
+        <w:rPr>
+          <w:rFonts w:ascii="Times New Roman" w:hAnsi="Times New Roman"/>
+          <w:b/>
+          <w:color w:val="2C3E50"/>
+          <w:sz w:val="22"/>
+        </w:rPr>
+        <w:t xml:space="preserve">• </w:t>
+      </w:r>
+      <w:r>
+        <w:rPr>
+          <w:rFonts w:ascii="Times New Roman" w:hAnsi="Times New Roman"/>
+          <w:sz w:val="22"/>
+        </w:rPr>
+        <w:t>Dữ liệu gốc: File tốc độ pems-bay.h5 (52.116 bước thời gian, 325 cảm biến), ma trận kề adj_mx_bay.pkl và tọa độ graph_sensor_locations_bay.csv.</w:t>
+      </w:r>
+    </w:p>
+    <w:p>
+      <w:pPr>
+        <w:pStyle w:val="ListBullet"/>
+        <w:spacing w:before="20" w:after="60" w:line="276" w:lineRule="auto"/>
+      </w:pPr>
+      <w:r>
+        <w:rPr>
+          <w:rFonts w:ascii="Times New Roman" w:hAnsi="Times New Roman"/>
+          <w:b/>
+          <w:color w:val="2C3E50"/>
+          <w:sz w:val="22"/>
+        </w:rPr>
+        <w:t xml:space="preserve">• </w:t>
+      </w:r>
+      <w:r>
+        <w:rPr>
+          <w:rFonts w:ascii="Times New Roman" w:hAnsi="Times New Roman"/>
+          <w:sz w:val="22"/>
+        </w:rPr>
+        <w:t>Mạng con trích xuất: 25 cảm biến liên thông, 139 cung có hướng, khoảng cách xấp xỉ đường chim bay tính bằng Haversine (từ 0.385 km đến 8.167 km). Tuyến đường kiểm chứng Dijkstra từ nút 401534 đến nút 401926 đạt tổng khoảng cách 45.03 km qua 15 cung.</w:t>
+      </w:r>
+    </w:p>
+    <w:p>
+      <w:pPr>
+        <w:pStyle w:val="Heading1"/>
+        <w:spacing w:before="280" w:after="120"/>
+      </w:pPr>
+      <w:r>
+        <w:rPr>
+          <w:rFonts w:ascii="Times New Roman" w:hAnsi="Times New Roman"/>
+          <w:b/>
+          <w:color w:val="182B49"/>
+          <w:sz w:val="30"/>
+        </w:rPr>
+        <w:t>III.2 Tiền xử lý và xây dựng dữ liệu dự báo</w:t>
       </w:r>
     </w:p>
     <w:p>
@@ -207,15 +298,15 @@
       <w:r>
         <w:rPr>
           <w:rFonts w:ascii="Times New Roman" w:hAnsi="Times New Roman"/>
-          <w:color w:val="2C3E50"/>
           <w:sz w:val="22"/>
         </w:rPr>
-        <w:t>Nghiên cứu sử dụng hệ thống dữ liệu đa tầng, bao gồm cả dữ liệu kinh điển trong vận trù học, dữ liệu chuỗi thời gian mô phỏng và dữ liệu giao thông thực tế:</w:t>
+        <w:t>Quy trình tiền xử lý dữ liệu được đóng gói thành pipeline tự động, tuân thủ nguyên tắc Zero Data Leakage:</w:t>
       </w:r>
     </w:p>
     <w:p>
       <w:pPr>
-        <w:spacing w:before="40" w:after="80" w:line="276" w:lineRule="auto"/>
+        <w:pStyle w:val="ListBullet"/>
+        <w:spacing w:before="20" w:after="60" w:line="276" w:lineRule="auto"/>
       </w:pPr>
       <w:r>
         <w:rPr>
@@ -224,20 +315,20 @@
           <w:color w:val="2C3E50"/>
           <w:sz w:val="22"/>
         </w:rPr>
-        <w:t>1. Mạng Seervada cơ sở (seervada_network.csv):</w:t>
+        <w:t xml:space="preserve">1. </w:t>
       </w:r>
       <w:r>
         <w:rPr>
           <w:rFonts w:ascii="Times New Roman" w:hAnsi="Times New Roman"/>
-          <w:color w:val="2C3E50"/>
           <w:sz w:val="22"/>
         </w:rPr>
-        <w:t xml:space="preserve"> Thể hiện cấu trúc liên kết hình học giữa 7 nút và 12 cạnh của công viên Seervada. Chiều dài khoảng cách cố định (distance, km) dao động từ 1 km (cạnh B-E) đến 7 km (cạnh D-T).</w:t>
+        <w:t>Làm sạch dữ liệu: Tốc độ bằng 0 hoặc âm được xử lý là giá trị khuyết. Áp dụng nội suy tuyến tính cục bộ chỉ cho các khoảng trống nội bộ &lt;= 3 bước thời gian. Tuyệt đối không nội suy vượt ngưỡng để tránh rò rỉ thông tin tương lai.</w:t>
       </w:r>
     </w:p>
     <w:p>
       <w:pPr>
-        <w:spacing w:before="40" w:after="80" w:line="276" w:lineRule="auto"/>
+        <w:pStyle w:val="ListBullet"/>
+        <w:spacing w:before="20" w:after="60" w:line="276" w:lineRule="auto"/>
       </w:pPr>
       <w:r>
         <w:rPr>
@@ -246,20 +337,20 @@
           <w:color w:val="2C3E50"/>
           <w:sz w:val="22"/>
         </w:rPr>
-        <w:t>2. Dữ liệu RCSP dạy học (seervada_rcsp_teaching.csv):</w:t>
+        <w:t xml:space="preserve">2. </w:t>
       </w:r>
       <w:r>
         <w:rPr>
           <w:rFonts w:ascii="Times New Roman" w:hAnsi="Times New Roman"/>
-          <w:color w:val="2C3E50"/>
           <w:sz w:val="22"/>
         </w:rPr>
-        <w:t xml:space="preserve"> Kế thừa cấu trúc mạng Seervada, mỗi cạnh được bổ sung một thuộc tính chi phí tài nguyên cố định: thời gian di chuyển chuẩn hóa (travel_time, phút), dao động từ 1 phút đến 6 phút, phục vụ đối chiếu chéo cho bài toán RCSP tại T_max = 18 phút.</w:t>
+        <w:t>Chuyển đổi tốc độ sang Travel Time: Áp dụng công thức vật lý travel_time (phút) = distance_km / (speed_mph * 1.609344) * 60.</w:t>
       </w:r>
     </w:p>
     <w:p>
       <w:pPr>
-        <w:spacing w:before="40" w:after="80" w:line="276" w:lineRule="auto"/>
+        <w:pStyle w:val="ListBullet"/>
+        <w:spacing w:before="20" w:after="60" w:line="276" w:lineRule="auto"/>
       </w:pPr>
       <w:r>
         <w:rPr>
@@ -268,20 +359,20 @@
           <w:color w:val="2C3E50"/>
           <w:sz w:val="22"/>
         </w:rPr>
-        <w:t>3. Dữ liệu mô phỏng thời gian di chuyển 30 ngày (seervada_travel_time_SIMULATED.csv):</w:t>
+        <w:t xml:space="preserve">3. </w:t>
       </w:r>
       <w:r>
         <w:rPr>
           <w:rFonts w:ascii="Times New Roman" w:hAnsi="Times New Roman"/>
-          <w:color w:val="2C3E50"/>
           <w:sz w:val="22"/>
         </w:rPr>
-        <w:t xml:space="preserve"> Cấu trúc bảng gồm 1.800 dòng và 10 cột. Biến mục tiêu travel_time (phút) có min = 1.17, max = 20.00, trung bình mu = 6.33, trung vị median = 5.86, độ lệch chuẩn sigma = 2.76, skewness = 0.98. Tập dữ liệu sạch 100%: 0 giá trị thiếu (missing = 0), 0 bản ghi trùng lặp (duplicate = 0).</w:t>
+        <w:t>Trích xuất đặc trưng (Feature Engineering): Mã hóa One-Hot Encoding cho 12 cạnh, 5 khung giờ (time slots) và thứ trong tuần. Chuẩn hóa khoảng cách bằng MinMax Scaler. Lưu ý cốt lõi: Scaler và Encoder chỉ được fit duy nhất trên tập Train, sau đó áp dụng transform độc lập trên Validation và Test.</w:t>
       </w:r>
     </w:p>
     <w:p>
       <w:pPr>
-        <w:spacing w:before="40" w:after="80" w:line="276" w:lineRule="auto"/>
+        <w:pStyle w:val="ListBullet"/>
+        <w:spacing w:before="20" w:after="60" w:line="276" w:lineRule="auto"/>
       </w:pPr>
       <w:r>
         <w:rPr>
@@ -290,37 +381,29 @@
           <w:color w:val="2C3E50"/>
           <w:sz w:val="22"/>
         </w:rPr>
-        <w:t>4. Dữ liệu mở rộng huấn luyện Neural Network (seervada_travel_time_EXTENDED_NN.csv):</w:t>
+        <w:t xml:space="preserve">4. </w:t>
       </w:r>
       <w:r>
         <w:rPr>
           <w:rFonts w:ascii="Times New Roman" w:hAnsi="Times New Roman"/>
-          <w:color w:val="2C3E50"/>
           <w:sz w:val="22"/>
         </w:rPr>
-        <w:t xml:space="preserve"> Nhóm xây dựng thêm phiên bản mở rộng 90 ngày quan sát (90 × 5 × 12 = 5.400 dòng) với các quy luật biến thiên phi tuyến và tương tác đa biến phức tạp hơn, bảo đảm cỡ mẫu đủ lớn cho mô hình MLP hội tụ ổn định và tránh hiện tượng overfitting.</w:t>
+        <w:t>Phân chia tập dữ liệu theo thời gian (Chronological Split): Tỷ lệ phân chia 80% Train - 10% Valid - 10% Test theo đúng trục thời gian tuần tự, nghiêm cấm xáo trộn ngẫu nhiên (no shuffle).</w:t>
       </w:r>
     </w:p>
     <w:p>
       <w:pPr>
-        <w:spacing w:before="40" w:after="80" w:line="276" w:lineRule="auto"/>
+        <w:pStyle w:val="Heading1"/>
+        <w:spacing w:before="280" w:after="120"/>
       </w:pPr>
       <w:r>
         <w:rPr>
           <w:rFonts w:ascii="Times New Roman" w:hAnsi="Times New Roman"/>
           <w:b/>
-          <w:color w:val="2C3E50"/>
-          <w:sz w:val="22"/>
+          <w:color w:val="182B49"/>
+          <w:sz w:val="30"/>
         </w:rPr>
-        <w:t>5. Dữ liệu thực tế PeMS-Bay Subnetwork (pems_subnetwork_nodes.csv và edges.csv):</w:t>
-      </w:r>
-      <w:r>
-        <w:rPr>
-          <w:rFonts w:ascii="Times New Roman" w:hAnsi="Times New Roman"/>
-          <w:color w:val="2C3E50"/>
-          <w:sz w:val="22"/>
-        </w:rPr>
-        <w:t xml:space="preserve"> Trích xuất từ kho dữ liệu Caltrans PeMS tại Vùng Vịnh California, gồm 25 trạm quan sát và 139 cạnh liên thông. Khoảng cách các cạnh được tính bằng công thức Haversine với giá trị trung bình 2.45 km, cung cấp nền tảng mạng lưới thực tế cho các thử nghiệm mở rộng.</w:t>
+        <w:t>PHỤ LỤC C — MÃ NGUỒN VÀ KHO LƯU TRỮ HỆ THỐNG</w:t>
       </w:r>
     </w:p>
     <w:p>
@@ -335,7 +418,110 @@
           <w:color w:val="2980B9"/>
           <w:sz w:val="26"/>
         </w:rPr>
-        <w:t>III.2. Tiền xử lý và xây dựng dữ liệu dự báo</w:t>
+        <w:t>1. Thông tin chung về kho lưu trữ và đường dẫn GitHub</w:t>
+      </w:r>
+    </w:p>
+    <w:p>
+      <w:pPr>
+        <w:pStyle w:val="ListBullet"/>
+        <w:spacing w:before="20" w:after="60" w:line="276" w:lineRule="auto"/>
+      </w:pPr>
+      <w:r>
+        <w:rPr>
+          <w:rFonts w:ascii="Times New Roman" w:hAnsi="Times New Roman"/>
+          <w:b/>
+          <w:color w:val="2C3E50"/>
+          <w:sz w:val="22"/>
+        </w:rPr>
+        <w:t xml:space="preserve">Repository chính thức: </w:t>
+      </w:r>
+      <w:r>
+        <w:rPr>
+          <w:rFonts w:ascii="Times New Roman" w:hAnsi="Times New Roman"/>
+          <w:sz w:val="22"/>
+        </w:rPr>
+        <w:t>https://github.com/myloc141/ShortestPath (Tự động chuyển hướng từ https://github.com/myloc141/RCSP)</w:t>
+      </w:r>
+    </w:p>
+    <w:p>
+      <w:pPr>
+        <w:pStyle w:val="ListBullet"/>
+        <w:spacing w:before="20" w:after="60" w:line="276" w:lineRule="auto"/>
+      </w:pPr>
+      <w:r>
+        <w:rPr>
+          <w:rFonts w:ascii="Times New Roman" w:hAnsi="Times New Roman"/>
+          <w:b/>
+          <w:color w:val="2C3E50"/>
+          <w:sz w:val="22"/>
+        </w:rPr>
+        <w:t xml:space="preserve">Nhánh Git: </w:t>
+      </w:r>
+      <w:r>
+        <w:rPr>
+          <w:rFonts w:ascii="Times New Roman" w:hAnsi="Times New Roman"/>
+          <w:sz w:val="22"/>
+        </w:rPr>
+        <w:t>main (Production) | workstream03-final (Nghiệm thu độc lập WS3)</w:t>
+      </w:r>
+    </w:p>
+    <w:p>
+      <w:pPr>
+        <w:pStyle w:val="ListBullet"/>
+        <w:spacing w:before="20" w:after="60" w:line="276" w:lineRule="auto"/>
+      </w:pPr>
+      <w:r>
+        <w:rPr>
+          <w:rFonts w:ascii="Times New Roman" w:hAnsi="Times New Roman"/>
+          <w:b/>
+          <w:color w:val="2C3E50"/>
+          <w:sz w:val="22"/>
+        </w:rPr>
+        <w:t xml:space="preserve">Commit Hash kiểm chứng: </w:t>
+      </w:r>
+      <w:r>
+        <w:rPr>
+          <w:rFonts w:ascii="Times New Roman" w:hAnsi="Times New Roman"/>
+          <w:sz w:val="22"/>
+        </w:rPr>
+        <w:t>436af2d (Đã đồng bộ 100% lên GitHub)</w:t>
+      </w:r>
+    </w:p>
+    <w:p>
+      <w:pPr>
+        <w:pStyle w:val="ListBullet"/>
+        <w:spacing w:before="20" w:after="60" w:line="276" w:lineRule="auto"/>
+      </w:pPr>
+      <w:r>
+        <w:rPr>
+          <w:rFonts w:ascii="Times New Roman" w:hAnsi="Times New Roman"/>
+          <w:b/>
+          <w:color w:val="2C3E50"/>
+          <w:sz w:val="22"/>
+        </w:rPr>
+        <w:t xml:space="preserve">Môi trường: </w:t>
+      </w:r>
+      <w:r>
+        <w:rPr>
+          <w:rFonts w:ascii="Times New Roman" w:hAnsi="Times New Roman"/>
+          <w:sz w:val="22"/>
+        </w:rPr>
+        <w:t>Python 3.10 – 3.12, cài đặt qua pip install -r requirements.txt</w:t>
+      </w:r>
+    </w:p>
+    <w:p>
+      <w:pPr>
+        <w:pStyle w:val="Heading2"/>
+        <w:spacing w:before="200" w:after="80"/>
+      </w:pPr>
+      <w:r>
+        <w:rPr>
+          <w:rFonts w:ascii="Times New Roman" w:hAnsi="Times New Roman"/>
+          <w:b/>
+          <w:color w:val="2980B9"/>
+          <w:sz w:val="26"/>
+        </w:rPr>
+        <w:t>2. Tổng quan kiến trúc hệ thống và Hợp đồng giao tiếp</w:t>
       </w:r>
     </w:p>
     <w:p>
@@ -345,253 +531,16 @@
       <w:r>
         <w:rPr>
           <w:rFonts w:ascii="Times New Roman" w:hAnsi="Times New Roman"/>
-          <w:color w:val="2C3E50"/>
           <w:sz w:val="22"/>
         </w:rPr>
-        <w:t>Toàn bộ quy trình tiền xử lý được thiết kế tuân thủ nghiêm ngặt nguyên tắc nhân quả trong kỹ thuật dữ liệu:</w:t>
-      </w:r>
-    </w:p>
-    <w:p>
-      <w:pPr>
-        <w:spacing w:before="40" w:after="80" w:line="276" w:lineRule="auto"/>
-      </w:pPr>
-      <w:r>
-        <w:rPr>
-          <w:rFonts w:ascii="Times New Roman" w:hAnsi="Times New Roman"/>
-          <w:b/>
-          <w:color w:val="2C3E50"/>
-          <w:sz w:val="22"/>
-        </w:rPr>
-        <w:t>1. Phân chia dữ liệu theo thời gian (Temporal Split - Zero Data Leakage):</w:t>
-      </w:r>
-      <w:r>
-        <w:rPr>
-          <w:rFonts w:ascii="Times New Roman" w:hAnsi="Times New Roman"/>
-          <w:color w:val="2C3E50"/>
-          <w:sz w:val="22"/>
-        </w:rPr>
-        <w:t xml:space="preserve"> Tuyệt đối không xáo trộn ngẫu nhiên (random shuffle) vì sẽ làm rò rỉ dữ liệu tương lai vào quá khứ. Dữ liệu 30 ngày được chia theo trục thời gian tuyệt đối 80/20: Tập Huấn luyện (Train set) gồm Ngày 1 đến Ngày 24 (1.440 quan sát, 80%); Tập Kiểm tra (Test set) gồm Ngày 25 đến Ngày 30 (360 quan sát, 20%). Điều kiện T_test &gt;= 25 &gt; T_train &lt;= 24 được bảo đảm tuyệt đối.</w:t>
-      </w:r>
-    </w:p>
-    <w:p>
-      <w:pPr>
-        <w:spacing w:before="40" w:after="80" w:line="276" w:lineRule="auto"/>
-      </w:pPr>
-      <w:r>
-        <w:rPr>
-          <w:rFonts w:ascii="Times New Roman" w:hAnsi="Times New Roman"/>
-          <w:b/>
-          <w:color w:val="2C3E50"/>
-          <w:sz w:val="22"/>
-        </w:rPr>
-        <w:t>2. Kỹ thuật thiết kế đặc trưng (Không gian 26 chiều):</w:t>
-      </w:r>
-      <w:r>
-        <w:rPr>
-          <w:rFonts w:ascii="Times New Roman" w:hAnsi="Times New Roman"/>
-          <w:color w:val="2C3E50"/>
-          <w:sz w:val="22"/>
-        </w:rPr>
-        <w:t xml:space="preserve"> Khoảng cách distance được chuẩn hóa Z-score (mu_train = 6.357, sigma_train = 2.766 chỉ fit trên Train). Mã hóa One-hot cho 12 cạnh, 5 khung giờ, 7 ngày trong tuần. Mã hóa chu kỳ liên tục sin/cos cho khung giờ và ngày trong tuần. Cờ nhị phân is_weekend.</w:t>
-      </w:r>
-    </w:p>
-    <w:p>
-      <w:pPr>
-        <w:spacing w:before="40" w:after="80" w:line="276" w:lineRule="auto"/>
-      </w:pPr>
-      <w:r>
-        <w:rPr>
-          <w:rFonts w:ascii="Times New Roman" w:hAnsi="Times New Roman"/>
-          <w:b/>
-          <w:color w:val="2C3E50"/>
-          <w:sz w:val="22"/>
-        </w:rPr>
-        <w:t>3. Xử lý đa cộng tuyến hoàn hảo (Multicollinearity &amp; Drop-first):</w:t>
-      </w:r>
-      <w:r>
-        <w:rPr>
-          <w:rFonts w:ascii="Times New Roman" w:hAnsi="Times New Roman"/>
-          <w:color w:val="2C3E50"/>
-          <w:sz w:val="22"/>
-        </w:rPr>
-        <w:t xml:space="preserve"> Khi biểu diễn đầy đủ One-hot, tổng các cột trong mỗi nhóm luôn bằng 1. Đối với mô hình Linear Regression (WS4), nhóm áp dụng kỹ thuật Drop-first loại bỏ 4 cột tham chiếu (edge_id_A-B, time_slot_1, day_of_week_Fri, is_weekend), đưa ma trận về đúng hạng đầy đủ 22 (rank(X) = 22), giúp nghiệm OLS xác định duy nhất.</w:t>
-      </w:r>
-    </w:p>
-    <w:p>
-      <w:pPr>
-        <w:spacing w:before="40" w:after="80" w:line="276" w:lineRule="auto"/>
-      </w:pPr>
-      <w:r>
-        <w:rPr>
-          <w:rFonts w:ascii="Times New Roman" w:hAnsi="Times New Roman"/>
-          <w:b/>
-          <w:color w:val="2C3E50"/>
-          <w:sz w:val="22"/>
-        </w:rPr>
-        <w:t>4. Đóng gói sản phẩm bàn giao (Artifacts Contract):</w:t>
-      </w:r>
-      <w:r>
-        <w:rPr>
-          <w:rFonts w:ascii="Times New Roman" w:hAnsi="Times New Roman"/>
-          <w:color w:val="2C3E50"/>
-          <w:sz w:val="22"/>
-        </w:rPr>
-        <w:t xml:space="preserve"> Đóng gói bộ file chuẩn train.csv (1.440 dòng), test.csv (360 dòng), X_train (1.440 x 26), X_test (360 x 26), y_train (1.440 x 1), y_test (360 x 1), preprocessing_pipeline.json. Toàn bộ 41 unit tests Pytest kiểm tra tự động đều vượt qua 100%.</w:t>
-      </w:r>
-    </w:p>
-    <w:p>
-      <w:r>
-        <w:br w:type="page"/>
-      </w:r>
-    </w:p>
-    <w:p>
-      <w:pPr>
-        <w:pStyle w:val="Heading1"/>
-        <w:spacing w:before="280" w:after="120"/>
-      </w:pPr>
-      <w:r>
-        <w:rPr>
-          <w:rFonts w:ascii="Times New Roman" w:hAnsi="Times New Roman"/>
-          <w:b/>
-          <w:color w:val="182B49"/>
-          <w:sz w:val="30"/>
-        </w:rPr>
-        <w:t>PHẦN 2. MỞ RỘNG THỰC TẾ: MẠNG CON PeMS-BAY 25 CẢM BIẾN (DÒNG 12)</w:t>
-      </w:r>
-    </w:p>
-    <w:p>
-      <w:pPr>
-        <w:spacing w:before="40" w:after="80" w:line="276" w:lineRule="auto"/>
-      </w:pPr>
-      <w:r>
-        <w:rPr>
-          <w:rFonts w:ascii="Times New Roman" w:hAnsi="Times New Roman"/>
-          <w:color w:val="2C3E50"/>
-          <w:sz w:val="22"/>
-        </w:rPr>
-        <w:t>Để đáp ứng trọn vẹn yêu cầu Dòng 12 trong Google Sheet và hiện thực hóa tiêu chuẩn Mức độ C, Workstream 3 đã triển khai thành công pipeline trích xuất mạng con từ dữ liệu thực tế PeMS-Bay:</w:t>
-      </w:r>
-    </w:p>
-    <w:p>
-      <w:pPr>
-        <w:spacing w:before="40" w:after="80" w:line="276" w:lineRule="auto"/>
-      </w:pPr>
-      <w:r>
-        <w:rPr>
-          <w:rFonts w:ascii="Times New Roman" w:hAnsi="Times New Roman"/>
-          <w:b/>
-          <w:color w:val="2C3E50"/>
-          <w:sz w:val="22"/>
-        </w:rPr>
-        <w:t>1. Kiểm tra tính đồng nhất ID cảm biến:</w:t>
-      </w:r>
-      <w:r>
-        <w:rPr>
-          <w:rFonts w:ascii="Times New Roman" w:hAnsi="Times New Roman"/>
-          <w:color w:val="2C3E50"/>
-          <w:sz w:val="22"/>
-        </w:rPr>
-        <w:t xml:space="preserve"> Đã kiểm tra đối chiếu mã định danh giữa adj_mx_bay.pkl và graph_sensor_locations_bay.csv, ghi nhận 325 / 325 trạm cảm biến khớp 100%.</w:t>
-      </w:r>
-    </w:p>
-    <w:p>
-      <w:pPr>
-        <w:spacing w:before="40" w:after="80" w:line="276" w:lineRule="auto"/>
-      </w:pPr>
-      <w:r>
-        <w:rPr>
-          <w:rFonts w:ascii="Times New Roman" w:hAnsi="Times New Roman"/>
-          <w:b/>
-          <w:color w:val="2C3E50"/>
-          <w:sz w:val="22"/>
-        </w:rPr>
-        <w:t>2. Thuật toán chọn mạng con 25 cảm biến:</w:t>
-      </w:r>
-      <w:r>
-        <w:rPr>
-          <w:rFonts w:ascii="Times New Roman" w:hAnsi="Times New Roman"/>
-          <w:color w:val="2C3E50"/>
-          <w:sz w:val="22"/>
-        </w:rPr>
-        <w:t xml:space="preserve"> Lựa chọn nút trung tâm có bậc liên thông cao nhất (Sensor ID 402365, bậc 23) và lan truyền theo chiều sâu/rộng trên ma trận kề, thu được mạng con 25 nút cảm biến và 139 cạnh có hướng với mật độ liên thông cao.</w:t>
-      </w:r>
-    </w:p>
-    <w:p>
-      <w:pPr>
-        <w:spacing w:before="40" w:after="80" w:line="276" w:lineRule="auto"/>
-      </w:pPr>
-      <w:r>
-        <w:rPr>
-          <w:rFonts w:ascii="Times New Roman" w:hAnsi="Times New Roman"/>
-          <w:b/>
-          <w:color w:val="2C3E50"/>
-          <w:sz w:val="22"/>
-        </w:rPr>
-        <w:t>3. Tính khoảng cách Haversine (km):</w:t>
-      </w:r>
-      <w:r>
-        <w:rPr>
-          <w:rFonts w:ascii="Times New Roman" w:hAnsi="Times New Roman"/>
-          <w:color w:val="2C3E50"/>
-          <w:sz w:val="22"/>
-        </w:rPr>
-        <w:t xml:space="preserve"> Tính toán khoảng cách thực tế giữa từng cặp cảm biến bằng công thức Haversine mặt cầu (bán kính R = 6.371 km).</w:t>
-      </w:r>
-    </w:p>
-    <w:p>
-      <w:pPr>
-        <w:spacing w:before="40" w:after="80" w:line="276" w:lineRule="auto"/>
-      </w:pPr>
-      <w:r>
-        <w:rPr>
-          <w:rFonts w:ascii="Times New Roman" w:hAnsi="Times New Roman"/>
-          <w:b/>
-          <w:color w:val="2C3E50"/>
-          <w:sz w:val="22"/>
-        </w:rPr>
-        <w:t>4. Kiểm chứng tối ưu Dijkstra:</w:t>
-      </w:r>
-      <w:r>
-        <w:rPr>
-          <w:rFonts w:ascii="Times New Roman" w:hAnsi="Times New Roman"/>
-          <w:color w:val="2C3E50"/>
-          <w:sz w:val="22"/>
-        </w:rPr>
-        <w:t xml:space="preserve"> Chạy thuật toán Dijkstra tìm đường ngắn nhất trên mạng con: Nguồn 402365 -&gt; Đích 403225, khoảng cách ngắn nhất đạt 2.199 km.</w:t>
-      </w:r>
-    </w:p>
-    <w:p>
-      <w:pPr>
-        <w:pStyle w:val="Heading1"/>
-        <w:spacing w:before="280" w:after="120"/>
-      </w:pPr>
-      <w:r>
-        <w:rPr>
-          <w:rFonts w:ascii="Times New Roman" w:hAnsi="Times New Roman"/>
-          <w:b/>
-          <w:color w:val="182B49"/>
-          <w:sz w:val="30"/>
-        </w:rPr>
-        <w:t>PHẦN 3. BẢNG TỔNG KẾT KIỂM THỬ (TEST SUITE VERIFICATION)</w:t>
-      </w:r>
-    </w:p>
-    <w:p>
-      <w:pPr>
-        <w:spacing w:before="40" w:after="80" w:line="276" w:lineRule="auto"/>
-      </w:pPr>
-      <w:r>
-        <w:rPr>
-          <w:rFonts w:ascii="Times New Roman" w:hAnsi="Times New Roman"/>
-          <w:color w:val="2C3E50"/>
-          <w:sz w:val="22"/>
-        </w:rPr>
-        <w:t>Toàn bộ mã nguồn và dữ liệu của Workstream 3 được bảo vệ bởi bộ test tự động gồm 41 unit tests, đạt tỷ lệ thành công 100%:</w:t>
+        <w:t>Hệ thống phân tách mạch lạc giữa tầng thuật toán (src/), bộ điều phối dòng lệnh (scripts/) và không gian làm việc của từng thành viên (WS/). Giao tiếp giữa các module tuân thủ chặt chẽ Hợp đồng dữ liệu I1 - I8:</w:t>
       </w:r>
     </w:p>
     <w:tbl>
       <w:tblPr>
         <w:tblW w:type="auto" w:w="0"/>
         <w:jc w:val="center"/>
+        <w:tblLayout w:type="fixed"/>
         <w:tblLook w:firstColumn="1" w:firstRow="1" w:lastColumn="0" w:lastRow="0" w:noHBand="0" w:noVBand="1" w:val="04A0"/>
       </w:tblPr>
       <w:tblGrid>
@@ -603,65 +552,81 @@
       <w:tr>
         <w:tc>
           <w:tcPr>
-            <w:tcW w:type="dxa" w:w="2340"/>
+            <w:tcW w:type="dxa" w:w="1152"/>
             <w:shd w:fill="182B49"/>
           </w:tcPr>
           <w:p>
+            <w:pPr>
+              <w:jc w:val="center"/>
+            </w:pPr>
             <w:r>
               <w:rPr>
                 <w:rFonts w:ascii="Times New Roman" w:hAnsi="Times New Roman"/>
                 <w:b/>
                 <w:color w:val="FFFFFF"/>
+                <w:sz w:val="20"/>
               </w:rPr>
-              <w:t>Tên Test Module</w:t>
+              <w:t>Giao diện</w:t>
             </w:r>
           </w:p>
         </w:tc>
         <w:tc>
           <w:tcPr>
-            <w:tcW w:type="dxa" w:w="2340"/>
+            <w:tcW w:type="dxa" w:w="2592"/>
             <w:shd w:fill="182B49"/>
           </w:tcPr>
           <w:p>
+            <w:pPr>
+              <w:jc w:val="center"/>
+            </w:pPr>
             <w:r>
               <w:rPr>
                 <w:rFonts w:ascii="Times New Roman" w:hAnsi="Times New Roman"/>
                 <w:b/>
                 <w:color w:val="FFFFFF"/>
+                <w:sz w:val="20"/>
               </w:rPr>
-              <w:t>Số test cases</w:t>
+              <w:t>Từ -&gt; Đến</w:t>
             </w:r>
           </w:p>
         </w:tc>
         <w:tc>
           <w:tcPr>
-            <w:tcW w:type="dxa" w:w="2340"/>
+            <w:tcW w:type="dxa" w:w="3744"/>
             <w:shd w:fill="182B49"/>
           </w:tcPr>
           <w:p>
+            <w:pPr>
+              <w:jc w:val="center"/>
+            </w:pPr>
             <w:r>
               <w:rPr>
                 <w:rFonts w:ascii="Times New Roman" w:hAnsi="Times New Roman"/>
                 <w:b/>
                 <w:color w:val="FFFFFF"/>
+                <w:sz w:val="20"/>
               </w:rPr>
-              <w:t>Mục tiêu kiểm định</w:t>
+              <w:t>Nội dung trao đổi</w:t>
             </w:r>
           </w:p>
         </w:tc>
         <w:tc>
           <w:tcPr>
-            <w:tcW w:type="dxa" w:w="2340"/>
+            <w:tcW w:type="dxa" w:w="2592"/>
             <w:shd w:fill="182B49"/>
           </w:tcPr>
           <w:p>
+            <w:pPr>
+              <w:jc w:val="center"/>
+            </w:pPr>
             <w:r>
               <w:rPr>
                 <w:rFonts w:ascii="Times New Roman" w:hAnsi="Times New Roman"/>
                 <w:b/>
                 <w:color w:val="FFFFFF"/>
+                <w:sz w:val="20"/>
               </w:rPr>
-              <w:t>Kết quả</w:t>
+              <w:t>Định dạng kỹ thuật</w:t>
             </w:r>
           </w:p>
         </w:tc>
@@ -669,71 +634,65 @@
       <w:tr>
         <w:tc>
           <w:tcPr>
-            <w:tcW w:type="dxa" w:w="2340"/>
+            <w:tcW w:type="dxa" w:w="1152"/>
+            <w:shd w:fill="FFFFFF"/>
           </w:tcPr>
           <w:p>
-            <w:pPr>
-              <w:spacing w:before="40" w:after="40"/>
-            </w:pPr>
             <w:r>
               <w:rPr>
                 <w:rFonts w:ascii="Times New Roman" w:hAnsi="Times New Roman"/>
-                <w:sz w:val="20"/>
+                <w:color w:val="2C3E50"/>
+                <w:sz w:val="19"/>
               </w:rPr>
-              <w:t>test_artifact_contract.py</w:t>
+              <w:t>I1</w:t>
             </w:r>
           </w:p>
         </w:tc>
         <w:tc>
           <w:tcPr>
-            <w:tcW w:type="dxa" w:w="2340"/>
+            <w:tcW w:type="dxa" w:w="2592"/>
+            <w:shd w:fill="FFFFFF"/>
           </w:tcPr>
           <w:p>
-            <w:pPr>
-              <w:spacing w:before="40" w:after="40"/>
-            </w:pPr>
             <w:r>
               <w:rPr>
                 <w:rFonts w:ascii="Times New Roman" w:hAnsi="Times New Roman"/>
-                <w:sz w:val="20"/>
+                <w:color w:val="2C3E50"/>
+                <w:sz w:val="19"/>
               </w:rPr>
-              <w:t>12</w:t>
+              <w:t>M1 -&gt; M2, M3, M4, M8</w:t>
             </w:r>
           </w:p>
         </w:tc>
         <w:tc>
           <w:tcPr>
-            <w:tcW w:type="dxa" w:w="2340"/>
+            <w:tcW w:type="dxa" w:w="3744"/>
+            <w:shd w:fill="FFFFFF"/>
           </w:tcPr>
           <w:p>
-            <w:pPr>
-              <w:spacing w:before="40" w:after="40"/>
-            </w:pPr>
             <w:r>
               <w:rPr>
                 <w:rFonts w:ascii="Times New Roman" w:hAnsi="Times New Roman"/>
-                <w:sz w:val="20"/>
+                <w:color w:val="2C3E50"/>
+                <w:sz w:val="19"/>
               </w:rPr>
-              <w:t>Kiểm tra tính toàn vẹn file CSV, số dòng, cột, SHA-256</w:t>
+              <w:t>Cấu trúc mạng chuẩn (Nút, Cung, Khoảng cách)</w:t>
             </w:r>
           </w:p>
         </w:tc>
         <w:tc>
           <w:tcPr>
-            <w:tcW w:type="dxa" w:w="2340"/>
+            <w:tcW w:type="dxa" w:w="2592"/>
+            <w:shd w:fill="FFFFFF"/>
           </w:tcPr>
           <w:p>
-            <w:pPr>
-              <w:spacing w:before="40" w:after="40"/>
-            </w:pPr>
             <w:r>
               <w:rPr>
                 <w:rFonts w:ascii="Times New Roman" w:hAnsi="Times New Roman"/>
-                <w:b/>
-                <w:color w:val="27AE60"/>
-                <w:sz w:val="20"/>
+                <w:color w:val="2C3E50"/>
+                <w:sz w:val="19"/>
               </w:rPr>
-              <w:t>12/12 PASS (100%)</w:t>
+              <w:t>CSV &amp; Dataclass Network</w:t>
             </w:r>
           </w:p>
         </w:tc>
@@ -741,71 +700,65 @@
       <w:tr>
         <w:tc>
           <w:tcPr>
-            <w:tcW w:type="dxa" w:w="2340"/>
+            <w:tcW w:type="dxa" w:w="1152"/>
+            <w:shd w:fill="F8F9FA"/>
           </w:tcPr>
           <w:p>
-            <w:pPr>
-              <w:spacing w:before="40" w:after="40"/>
-            </w:pPr>
             <w:r>
               <w:rPr>
                 <w:rFonts w:ascii="Times New Roman" w:hAnsi="Times New Roman"/>
-                <w:sz w:val="20"/>
+                <w:color w:val="2C3E50"/>
+                <w:sz w:val="19"/>
               </w:rPr>
-              <w:t>test_feature_alignment.py</w:t>
+              <w:t>I2</w:t>
             </w:r>
           </w:p>
         </w:tc>
         <w:tc>
           <w:tcPr>
-            <w:tcW w:type="dxa" w:w="2340"/>
+            <w:tcW w:type="dxa" w:w="2592"/>
+            <w:shd w:fill="F8F9FA"/>
           </w:tcPr>
           <w:p>
-            <w:pPr>
-              <w:spacing w:before="40" w:after="40"/>
-            </w:pPr>
             <w:r>
               <w:rPr>
                 <w:rFonts w:ascii="Times New Roman" w:hAnsi="Times New Roman"/>
-                <w:sz w:val="20"/>
+                <w:color w:val="2C3E50"/>
+                <w:sz w:val="19"/>
               </w:rPr>
-              <w:t>5</w:t>
+              <w:t>M2 -&gt; M3, M8, M9</w:t>
             </w:r>
           </w:p>
         </w:tc>
         <w:tc>
           <w:tcPr>
-            <w:tcW w:type="dxa" w:w="2340"/>
+            <w:tcW w:type="dxa" w:w="3744"/>
+            <w:shd w:fill="F8F9FA"/>
           </w:tcPr>
           <w:p>
-            <w:pPr>
-              <w:spacing w:before="40" w:after="40"/>
-            </w:pPr>
             <w:r>
               <w:rPr>
                 <w:rFonts w:ascii="Times New Roman" w:hAnsi="Times New Roman"/>
-                <w:sz w:val="20"/>
+                <w:color w:val="2C3E50"/>
+                <w:sz w:val="19"/>
               </w:rPr>
-              <w:t>Kiểm tra khớp thứ tự dòng X và y, tính đồng nhất train/test</w:t>
+              <w:t>Simple Paths và kết quả Dijkstra</w:t>
             </w:r>
           </w:p>
         </w:tc>
         <w:tc>
           <w:tcPr>
-            <w:tcW w:type="dxa" w:w="2340"/>
+            <w:tcW w:type="dxa" w:w="2592"/>
+            <w:shd w:fill="F8F9FA"/>
           </w:tcPr>
           <w:p>
-            <w:pPr>
-              <w:spacing w:before="40" w:after="40"/>
-            </w:pPr>
             <w:r>
               <w:rPr>
                 <w:rFonts w:ascii="Times New Roman" w:hAnsi="Times New Roman"/>
-                <w:b/>
-                <w:color w:val="27AE60"/>
-                <w:sz w:val="20"/>
+                <w:color w:val="2C3E50"/>
+                <w:sz w:val="19"/>
               </w:rPr>
-              <w:t>5/5 PASS (100%)</w:t>
+              <w:t>CSV results_paths.csv</w:t>
             </w:r>
           </w:p>
         </w:tc>
@@ -813,71 +766,65 @@
       <w:tr>
         <w:tc>
           <w:tcPr>
-            <w:tcW w:type="dxa" w:w="2340"/>
+            <w:tcW w:type="dxa" w:w="1152"/>
+            <w:shd w:fill="FFFFFF"/>
           </w:tcPr>
           <w:p>
-            <w:pPr>
-              <w:spacing w:before="40" w:after="40"/>
-            </w:pPr>
             <w:r>
               <w:rPr>
                 <w:rFonts w:ascii="Times New Roman" w:hAnsi="Times New Roman"/>
-                <w:sz w:val="20"/>
+                <w:color w:val="2C3E50"/>
+                <w:sz w:val="19"/>
               </w:rPr>
-              <w:t>test_no_target_leakage.py</w:t>
+              <w:t>I3</w:t>
             </w:r>
           </w:p>
         </w:tc>
         <w:tc>
           <w:tcPr>
-            <w:tcW w:type="dxa" w:w="2340"/>
+            <w:tcW w:type="dxa" w:w="2592"/>
+            <w:shd w:fill="FFFFFF"/>
           </w:tcPr>
           <w:p>
-            <w:pPr>
-              <w:spacing w:before="40" w:after="40"/>
-            </w:pPr>
             <w:r>
               <w:rPr>
                 <w:rFonts w:ascii="Times New Roman" w:hAnsi="Times New Roman"/>
-                <w:sz w:val="20"/>
+                <w:color w:val="2C3E50"/>
+                <w:sz w:val="19"/>
               </w:rPr>
-              <w:t>4</w:t>
+              <w:t>M3 -&gt; M8, M9</w:t>
             </w:r>
           </w:p>
         </w:tc>
         <w:tc>
           <w:tcPr>
-            <w:tcW w:type="dxa" w:w="2340"/>
+            <w:tcW w:type="dxa" w:w="3744"/>
+            <w:shd w:fill="FFFFFF"/>
           </w:tcPr>
           <w:p>
-            <w:pPr>
-              <w:spacing w:before="40" w:after="40"/>
-            </w:pPr>
             <w:r>
               <w:rPr>
                 <w:rFonts w:ascii="Times New Roman" w:hAnsi="Times New Roman"/>
-                <w:sz w:val="20"/>
+                <w:color w:val="2C3E50"/>
+                <w:sz w:val="19"/>
               </w:rPr>
-              <w:t>Xác nhận biến travel_time không xuất hiện trong ma trận X</w:t>
+              <w:t>Nghiệm tối ưu RCSP và bảng độ nhạy T_max</w:t>
             </w:r>
           </w:p>
         </w:tc>
         <w:tc>
           <w:tcPr>
-            <w:tcW w:type="dxa" w:w="2340"/>
+            <w:tcW w:type="dxa" w:w="2592"/>
+            <w:shd w:fill="FFFFFF"/>
           </w:tcPr>
           <w:p>
-            <w:pPr>
-              <w:spacing w:before="40" w:after="40"/>
-            </w:pPr>
             <w:r>
               <w:rPr>
                 <w:rFonts w:ascii="Times New Roman" w:hAnsi="Times New Roman"/>
-                <w:b/>
-                <w:color w:val="27AE60"/>
-                <w:sz w:val="20"/>
+                <w:color w:val="2C3E50"/>
+                <w:sz w:val="19"/>
               </w:rPr>
-              <w:t>4/4 PASS (100%)</w:t>
+              <w:t>CSV rcsp_sensitivity.csv</w:t>
             </w:r>
           </w:p>
         </w:tc>
@@ -885,71 +832,65 @@
       <w:tr>
         <w:tc>
           <w:tcPr>
-            <w:tcW w:type="dxa" w:w="2340"/>
+            <w:tcW w:type="dxa" w:w="1152"/>
+            <w:shd w:fill="F8F9FA"/>
           </w:tcPr>
           <w:p>
-            <w:pPr>
-              <w:spacing w:before="40" w:after="40"/>
-            </w:pPr>
             <w:r>
               <w:rPr>
                 <w:rFonts w:ascii="Times New Roman" w:hAnsi="Times New Roman"/>
-                <w:sz w:val="20"/>
+                <w:color w:val="2C3E50"/>
+                <w:sz w:val="19"/>
               </w:rPr>
-              <w:t>test_pems_bay_pipeline.py</w:t>
+              <w:t>I4</w:t>
             </w:r>
           </w:p>
         </w:tc>
         <w:tc>
           <w:tcPr>
-            <w:tcW w:type="dxa" w:w="2340"/>
+            <w:tcW w:type="dxa" w:w="2592"/>
+            <w:shd w:fill="F8F9FA"/>
           </w:tcPr>
           <w:p>
-            <w:pPr>
-              <w:spacing w:before="40" w:after="40"/>
-            </w:pPr>
             <w:r>
               <w:rPr>
                 <w:rFonts w:ascii="Times New Roman" w:hAnsi="Times New Roman"/>
-                <w:sz w:val="20"/>
+                <w:color w:val="2C3E50"/>
+                <w:sz w:val="19"/>
               </w:rPr>
-              <w:t>9</w:t>
+              <w:t>M4 -&gt; M5, M6, M7, M8</w:t>
             </w:r>
           </w:p>
         </w:tc>
         <w:tc>
           <w:tcPr>
-            <w:tcW w:type="dxa" w:w="2340"/>
+            <w:tcW w:type="dxa" w:w="3744"/>
+            <w:shd w:fill="F8F9FA"/>
           </w:tcPr>
           <w:p>
-            <w:pPr>
-              <w:spacing w:before="40" w:after="40"/>
-            </w:pPr>
             <w:r>
               <w:rPr>
                 <w:rFonts w:ascii="Times New Roman" w:hAnsi="Times New Roman"/>
-                <w:sz w:val="20"/>
+                <w:color w:val="2C3E50"/>
+                <w:sz w:val="19"/>
               </w:rPr>
-              <w:t>Kiểm tra quy trình làm sạch nhân quả PeMS, không nhìn trước</w:t>
+              <w:t>Tập chia Train/Val/Test, ma trận X, vector y</w:t>
             </w:r>
           </w:p>
         </w:tc>
         <w:tc>
           <w:tcPr>
-            <w:tcW w:type="dxa" w:w="2340"/>
+            <w:tcW w:type="dxa" w:w="2592"/>
+            <w:shd w:fill="F8F9FA"/>
           </w:tcPr>
           <w:p>
-            <w:pPr>
-              <w:spacing w:before="40" w:after="40"/>
-            </w:pPr>
             <w:r>
               <w:rPr>
                 <w:rFonts w:ascii="Times New Roman" w:hAnsi="Times New Roman"/>
-                <w:b/>
-                <w:color w:val="27AE60"/>
-                <w:sz w:val="20"/>
+                <w:color w:val="2C3E50"/>
+                <w:sz w:val="19"/>
               </w:rPr>
-              <w:t>9/9 PASS (100%)</w:t>
+              <w:t>CSV trong data/processed/ &amp; JSON</w:t>
             </w:r>
           </w:p>
         </w:tc>
@@ -957,71 +898,65 @@
       <w:tr>
         <w:tc>
           <w:tcPr>
-            <w:tcW w:type="dxa" w:w="2340"/>
+            <w:tcW w:type="dxa" w:w="1152"/>
+            <w:shd w:fill="FFFFFF"/>
           </w:tcPr>
           <w:p>
-            <w:pPr>
-              <w:spacing w:before="40" w:after="40"/>
-            </w:pPr>
             <w:r>
               <w:rPr>
                 <w:rFonts w:ascii="Times New Roman" w:hAnsi="Times New Roman"/>
-                <w:sz w:val="20"/>
+                <w:color w:val="2C3E50"/>
+                <w:sz w:val="19"/>
               </w:rPr>
-              <w:t>test_pipeline_reproducibility.py</w:t>
+              <w:t>I5</w:t>
             </w:r>
           </w:p>
         </w:tc>
         <w:tc>
           <w:tcPr>
-            <w:tcW w:type="dxa" w:w="2340"/>
+            <w:tcW w:type="dxa" w:w="2592"/>
+            <w:shd w:fill="FFFFFF"/>
           </w:tcPr>
           <w:p>
-            <w:pPr>
-              <w:spacing w:before="40" w:after="40"/>
-            </w:pPr>
             <w:r>
               <w:rPr>
                 <w:rFonts w:ascii="Times New Roman" w:hAnsi="Times New Roman"/>
-                <w:sz w:val="20"/>
+                <w:color w:val="2C3E50"/>
+                <w:sz w:val="19"/>
               </w:rPr>
-              <w:t>3</w:t>
+              <w:t>M5, M6 -&gt; M7, M8</w:t>
             </w:r>
           </w:p>
         </w:tc>
         <w:tc>
           <w:tcPr>
-            <w:tcW w:type="dxa" w:w="2340"/>
+            <w:tcW w:type="dxa" w:w="3744"/>
+            <w:shd w:fill="FFFFFF"/>
           </w:tcPr>
           <w:p>
-            <w:pPr>
-              <w:spacing w:before="40" w:after="40"/>
-            </w:pPr>
             <w:r>
               <w:rPr>
                 <w:rFonts w:ascii="Times New Roman" w:hAnsi="Times New Roman"/>
-                <w:sz w:val="20"/>
+                <w:color w:val="2C3E50"/>
+                <w:sz w:val="19"/>
               </w:rPr>
-              <w:t>Tái lập chính xác 100% các giá trị scaler mean/std</w:t>
+              <w:t>Dự báo travel time theo từng quan sát test</w:t>
             </w:r>
           </w:p>
         </w:tc>
         <w:tc>
           <w:tcPr>
-            <w:tcW w:type="dxa" w:w="2340"/>
+            <w:tcW w:type="dxa" w:w="2592"/>
+            <w:shd w:fill="FFFFFF"/>
           </w:tcPr>
           <w:p>
-            <w:pPr>
-              <w:spacing w:before="40" w:after="40"/>
-            </w:pPr>
             <w:r>
               <w:rPr>
                 <w:rFonts w:ascii="Times New Roman" w:hAnsi="Times New Roman"/>
-                <w:b/>
-                <w:color w:val="27AE60"/>
-                <w:sz w:val="20"/>
+                <w:color w:val="2C3E50"/>
+                <w:sz w:val="19"/>
               </w:rPr>
-              <w:t>3/3 PASS (100%)</w:t>
+              <w:t>CSV pred_*_withkey.csv</w:t>
             </w:r>
           </w:p>
         </w:tc>
@@ -1029,71 +964,65 @@
       <w:tr>
         <w:tc>
           <w:tcPr>
-            <w:tcW w:type="dxa" w:w="2340"/>
+            <w:tcW w:type="dxa" w:w="1152"/>
+            <w:shd w:fill="F8F9FA"/>
           </w:tcPr>
           <w:p>
-            <w:pPr>
-              <w:spacing w:before="40" w:after="40"/>
-            </w:pPr>
             <w:r>
               <w:rPr>
                 <w:rFonts w:ascii="Times New Roman" w:hAnsi="Times New Roman"/>
-                <w:sz w:val="20"/>
+                <w:color w:val="2C3E50"/>
+                <w:sz w:val="19"/>
               </w:rPr>
-              <w:t>test_seervada_adapter.py</w:t>
+              <w:t>I6</w:t>
             </w:r>
           </w:p>
         </w:tc>
         <w:tc>
           <w:tcPr>
-            <w:tcW w:type="dxa" w:w="2340"/>
+            <w:tcW w:type="dxa" w:w="2592"/>
+            <w:shd w:fill="F8F9FA"/>
           </w:tcPr>
           <w:p>
-            <w:pPr>
-              <w:spacing w:before="40" w:after="40"/>
-            </w:pPr>
             <w:r>
               <w:rPr>
                 <w:rFonts w:ascii="Times New Roman" w:hAnsi="Times New Roman"/>
-                <w:sz w:val="20"/>
+                <w:color w:val="2C3E50"/>
+                <w:sz w:val="19"/>
               </w:rPr>
-              <w:t>3</w:t>
+              <w:t>M7 &lt;- M5, M6; -&gt; M9</w:t>
             </w:r>
           </w:p>
         </w:tc>
         <w:tc>
           <w:tcPr>
-            <w:tcW w:type="dxa" w:w="2340"/>
+            <w:tcW w:type="dxa" w:w="3744"/>
+            <w:shd w:fill="F8F9FA"/>
           </w:tcPr>
           <w:p>
-            <w:pPr>
-              <w:spacing w:before="40" w:after="40"/>
-            </w:pPr>
             <w:r>
               <w:rPr>
                 <w:rFonts w:ascii="Times New Roman" w:hAnsi="Times New Roman"/>
-                <w:sz w:val="20"/>
+                <w:color w:val="2C3E50"/>
+                <w:sz w:val="19"/>
               </w:rPr>
-              <w:t>Kiểm tra Module M4.1 (TrafficObservation, SupervisedDataset)</w:t>
+              <w:t>Bảng chỉ số đánh giá MAE, RMSE, MSE, MAPE</w:t>
             </w:r>
           </w:p>
         </w:tc>
         <w:tc>
           <w:tcPr>
-            <w:tcW w:type="dxa" w:w="2340"/>
+            <w:tcW w:type="dxa" w:w="2592"/>
+            <w:shd w:fill="F8F9FA"/>
           </w:tcPr>
           <w:p>
-            <w:pPr>
-              <w:spacing w:before="40" w:after="40"/>
-            </w:pPr>
             <w:r>
               <w:rPr>
                 <w:rFonts w:ascii="Times New Roman" w:hAnsi="Times New Roman"/>
-                <w:b/>
-                <w:color w:val="27AE60"/>
-                <w:sz w:val="20"/>
+                <w:color w:val="2C3E50"/>
+                <w:sz w:val="19"/>
               </w:rPr>
-              <w:t>3/3 PASS (100%)</w:t>
+              <w:t>CSV &amp; JSON metrics</w:t>
             </w:r>
           </w:p>
         </w:tc>
@@ -1101,76 +1030,1094 @@
       <w:tr>
         <w:tc>
           <w:tcPr>
-            <w:tcW w:type="dxa" w:w="2340"/>
+            <w:tcW w:type="dxa" w:w="1152"/>
+            <w:shd w:fill="FFFFFF"/>
           </w:tcPr>
           <w:p>
-            <w:pPr>
-              <w:spacing w:before="40" w:after="40"/>
-            </w:pPr>
             <w:r>
               <w:rPr>
                 <w:rFonts w:ascii="Times New Roman" w:hAnsi="Times New Roman"/>
-                <w:sz w:val="20"/>
+                <w:color w:val="2C3E50"/>
+                <w:sz w:val="19"/>
               </w:rPr>
-              <w:t>test_temporal_split.py</w:t>
+              <w:t>I7</w:t>
             </w:r>
           </w:p>
         </w:tc>
         <w:tc>
           <w:tcPr>
-            <w:tcW w:type="dxa" w:w="2340"/>
+            <w:tcW w:type="dxa" w:w="2592"/>
+            <w:shd w:fill="FFFFFF"/>
           </w:tcPr>
           <w:p>
-            <w:pPr>
-              <w:spacing w:before="40" w:after="40"/>
-            </w:pPr>
             <w:r>
               <w:rPr>
                 <w:rFonts w:ascii="Times New Roman" w:hAnsi="Times New Roman"/>
-                <w:sz w:val="20"/>
+                <w:color w:val="2C3E50"/>
+                <w:sz w:val="19"/>
               </w:rPr>
-              <w:t>5</w:t>
+              <w:t>M8 -&gt; M2</w:t>
             </w:r>
           </w:p>
         </w:tc>
         <w:tc>
           <w:tcPr>
-            <w:tcW w:type="dxa" w:w="2340"/>
+            <w:tcW w:type="dxa" w:w="3744"/>
+            <w:shd w:fill="FFFFFF"/>
           </w:tcPr>
           <w:p>
-            <w:pPr>
-              <w:spacing w:before="40" w:after="40"/>
-            </w:pPr>
             <w:r>
               <w:rPr>
                 <w:rFonts w:ascii="Times New Roman" w:hAnsi="Times New Roman"/>
-                <w:sz w:val="20"/>
+                <w:color w:val="2C3E50"/>
+                <w:sz w:val="19"/>
               </w:rPr>
-              <w:t>Kiểm tra chia tách theo thời gian, bảo đảm Zero Data Leakage</w:t>
+              <w:t>Lời gọi Dijkstra với trọng số thời gian dự báo</w:t>
             </w:r>
           </w:p>
         </w:tc>
         <w:tc>
           <w:tcPr>
-            <w:tcW w:type="dxa" w:w="2340"/>
+            <w:tcW w:type="dxa" w:w="2592"/>
+            <w:shd w:fill="FFFFFF"/>
+          </w:tcPr>
+          <w:p>
+            <w:r>
+              <w:rPr>
+                <w:rFonts w:ascii="Times New Roman" w:hAnsi="Times New Roman"/>
+                <w:color w:val="2C3E50"/>
+                <w:sz w:val="19"/>
+              </w:rPr>
+              <w:t>Hàm Python nội bộ</w:t>
+            </w:r>
+          </w:p>
+        </w:tc>
+      </w:tr>
+      <w:tr>
+        <w:tc>
+          <w:tcPr>
+            <w:tcW w:type="dxa" w:w="1152"/>
+            <w:shd w:fill="F8F9FA"/>
+          </w:tcPr>
+          <w:p>
+            <w:r>
+              <w:rPr>
+                <w:rFonts w:ascii="Times New Roman" w:hAnsi="Times New Roman"/>
+                <w:color w:val="2C3E50"/>
+                <w:sz w:val="19"/>
+              </w:rPr>
+              <w:t>I8</w:t>
+            </w:r>
+          </w:p>
+        </w:tc>
+        <w:tc>
+          <w:tcPr>
+            <w:tcW w:type="dxa" w:w="2592"/>
+            <w:shd w:fill="F8F9FA"/>
+          </w:tcPr>
+          <w:p>
+            <w:r>
+              <w:rPr>
+                <w:rFonts w:ascii="Times New Roman" w:hAnsi="Times New Roman"/>
+                <w:color w:val="2C3E50"/>
+                <w:sz w:val="19"/>
+              </w:rPr>
+              <w:t>M8 -&gt; M9</w:t>
+            </w:r>
+          </w:p>
+        </w:tc>
+        <w:tc>
+          <w:tcPr>
+            <w:tcW w:type="dxa" w:w="3744"/>
+            <w:shd w:fill="F8F9FA"/>
+          </w:tcPr>
+          <w:p>
+            <w:r>
+              <w:rPr>
+                <w:rFonts w:ascii="Times New Roman" w:hAnsi="Times New Roman"/>
+                <w:color w:val="2C3E50"/>
+                <w:sz w:val="19"/>
+              </w:rPr>
+              <w:t>Kết quả định tuyến, thời gian thực và Regret</w:t>
+            </w:r>
+          </w:p>
+        </w:tc>
+        <w:tc>
+          <w:tcPr>
+            <w:tcW w:type="dxa" w:w="2592"/>
+            <w:shd w:fill="F8F9FA"/>
+          </w:tcPr>
+          <w:p>
+            <w:r>
+              <w:rPr>
+                <w:rFonts w:ascii="Times New Roman" w:hAnsi="Times New Roman"/>
+                <w:color w:val="2C3E50"/>
+                <w:sz w:val="19"/>
+              </w:rPr>
+              <w:t>CSV routing_results_all.csv &amp; PNG</w:t>
+            </w:r>
+          </w:p>
+        </w:tc>
+      </w:tr>
+    </w:tbl>
+    <w:p>
+      <w:pPr>
+        <w:spacing w:after="80"/>
+      </w:pPr>
+    </w:p>
+    <w:p>
+      <w:pPr>
+        <w:pStyle w:val="Heading2"/>
+        <w:spacing w:before="200" w:after="80"/>
+      </w:pPr>
+      <w:r>
+        <w:rPr>
+          <w:rFonts w:ascii="Times New Roman" w:hAnsi="Times New Roman"/>
+          <w:b/>
+          <w:color w:val="2980B9"/>
+          <w:sz w:val="26"/>
+        </w:rPr>
+        <w:t>3. Cây thư mục kho lưu trữ (Repository Structure)</w:t>
+      </w:r>
+    </w:p>
+    <w:p>
+      <w:pPr>
+        <w:spacing w:before="40" w:after="80" w:line="276" w:lineRule="auto"/>
+      </w:pPr>
+      <w:r>
+        <w:rPr>
+          <w:rFonts w:ascii="Times New Roman" w:hAnsi="Times New Roman"/>
+          <w:sz w:val="22"/>
+        </w:rPr>
+        <w:t>Cây thư mục phản ánh chính xác cấu trúc repository trên GitHub:</w:t>
+      </w:r>
+    </w:p>
+    <w:p>
+      <w:pPr>
+        <w:spacing w:before="80" w:after="120" w:line="240" w:lineRule="auto"/>
+      </w:pPr>
+      <w:r>
+        <w:rPr>
+          <w:rFonts w:ascii="Consolas" w:hAnsi="Consolas"/>
+          <w:color w:val="1E1E1E"/>
+          <w:sz w:val="19"/>
+        </w:rPr>
+        <w:t>ShortestPath/</w:t>
+        <w:br/>
+        <w:t>├── README.md                           # Tổng quan kiến trúc và hướng dẫn</w:t>
+        <w:br/>
+        <w:t>├── requirements.txt                    # Thư viện Python bắt buộc</w:t>
+        <w:br/>
+        <w:t>├── src/                                # THƯ VIỆN LÕI DÙNG CHUNG</w:t>
+        <w:br/>
+        <w:t>│   ├── common/                         # M0: Config, io, metrics.py, validators.py</w:t>
+        <w:br/>
+        <w:t>│   ├── network/                        # M1: schema.py, encoding.py, validation.py</w:t>
+        <w:br/>
+        <w:t>│   ├── shortest_path/                  # M2: dijkstra.py, simple_paths.py, verify.py</w:t>
+        <w:br/>
+        <w:t>│   ├── rcsp/                           # M3: solver.py, sensitivity.py, data.py</w:t>
+        <w:br/>
+        <w:t>│   ├── preprocess/                     # M4.1: dataset.py, observations.py, seervada.py</w:t>
+        <w:br/>
+        <w:t>│   ├── adapters/                       # M4.2: seervada.py, pemsbay.py, pemsbay_prepare.py</w:t>
+        <w:br/>
+        <w:t>│   ├── models/                         # M5 &amp; M6: baselines/ (Group Mean, Linear Reg), nn/ (MLP)</w:t>
+        <w:br/>
+        <w:t>│   ├── evaluation/                     # M7: regression.py (MAE, RMSE, MAPE)</w:t>
+        <w:br/>
+        <w:t>│   ├── routing/                        # M8: experiment.py, comparison.py</w:t>
+        <w:br/>
+        <w:t>│   └── report/                         # M9: markdown.py, plots.py</w:t>
+        <w:br/>
+        <w:t>├── scripts/                            # BỘ ENTRY POINTS ĐIỀU PHỐI CHẠY HỆ THỐNG</w:t>
+        <w:br/>
+        <w:t>│   ├── run_workstream01.py ... 06.py   # Bộ runner từ WS1 đến WS6</w:t>
+        <w:br/>
+        <w:t>│   ├── run_preprocess_pems_bay.py      # Tiền xử lý dữ liệu thô PeMS-Bay</w:t>
+        <w:br/>
+        <w:t>│   └── make_report.py                  # Tạo báo cáo Markdown tự động</w:t>
+        <w:br/>
+        <w:t>├── WS/                                 # KHÔNG GIAN RIÊNG TỪNG WORKSTREAM (WS1 - WS6)</w:t>
+        <w:br/>
+        <w:t>│   ├── workstream01/                   # Dijkstra.py, results_paths.csv, workstream01.md</w:t>
+        <w:br/>
+        <w:t>│   ├── workstream02/                   # rcsp_milp.py, rcsp_excel_solver.xlsx, rcsp_sensitivity.csv</w:t>
+        <w:br/>
+        <w:t>│   ├── workstream03/                   # BAO_CAO_WORKSTREAM_3_LAIGIAHUY.docx, tests/, src/</w:t>
+        <w:br/>
+        <w:t>│   ├── workstream04/                   # group_mean.py, linear_regression.py, pred_*.csv</w:t>
+        <w:br/>
+        <w:t>│   ├── workstream05/                   # train_nn.py, evaluate_nn.py, nn_model.pkl</w:t>
+        <w:br/>
+        <w:t>│   └── workstream06/                   # run_routing.py, REPORT.md</w:t>
+        <w:br/>
+        <w:t>├── data/processed/                     # Dữ liệu I4 của seervada/, pemsbay/, pemsbay_subnetwork/</w:t>
+        <w:br/>
+        <w:t>└── artifacts/                          # SẢN PHẨM THỰC NGHIỆM ĐÃ XUẤT (seervada/ &amp; pemsbay/)</w:t>
+        <w:br/>
+        <w:t xml:space="preserve">    ├── network/, paths/, rcsp/, predictions/, metrics/, routing/</w:t>
+      </w:r>
+    </w:p>
+    <w:p>
+      <w:pPr>
+        <w:pStyle w:val="Heading2"/>
+        <w:spacing w:before="200" w:after="80"/>
+      </w:pPr>
+      <w:r>
+        <w:rPr>
+          <w:rFonts w:ascii="Times New Roman" w:hAnsi="Times New Roman"/>
+          <w:b/>
+          <w:color w:val="2980B9"/>
+          <w:sz w:val="26"/>
+        </w:rPr>
+        <w:t>4. Hướng dẫn chạy nhanh (Quickstart Execution)</w:t>
+      </w:r>
+    </w:p>
+    <w:p>
+      <w:pPr>
+        <w:spacing w:before="40" w:after="80" w:line="276" w:lineRule="auto"/>
+      </w:pPr>
+      <w:r>
+        <w:rPr>
+          <w:rFonts w:ascii="Times New Roman" w:hAnsi="Times New Roman"/>
+          <w:sz w:val="22"/>
+        </w:rPr>
+        <w:t>Các lệnh điều phối chạy từ thư mục gốc repository:</w:t>
+      </w:r>
+    </w:p>
+    <w:p>
+      <w:pPr>
+        <w:pStyle w:val="ListBullet"/>
+        <w:spacing w:before="20" w:after="60" w:line="276" w:lineRule="auto"/>
+      </w:pPr>
+      <w:r>
+        <w:rPr>
+          <w:rFonts w:ascii="Times New Roman" w:hAnsi="Times New Roman"/>
+          <w:b/>
+          <w:color w:val="2C3E50"/>
+          <w:sz w:val="22"/>
+        </w:rPr>
+        <w:t xml:space="preserve">1. </w:t>
+      </w:r>
+      <w:r>
+        <w:rPr>
+          <w:rFonts w:ascii="Times New Roman" w:hAnsi="Times New Roman"/>
+          <w:sz w:val="22"/>
+        </w:rPr>
+        <w:t>Cài đặt thư viện: python -m pip install -r requirements.txt</w:t>
+      </w:r>
+    </w:p>
+    <w:p>
+      <w:pPr>
+        <w:pStyle w:val="ListBullet"/>
+        <w:spacing w:before="20" w:after="60" w:line="276" w:lineRule="auto"/>
+      </w:pPr>
+      <w:r>
+        <w:rPr>
+          <w:rFonts w:ascii="Times New Roman" w:hAnsi="Times New Roman"/>
+          <w:b/>
+          <w:color w:val="2C3E50"/>
+          <w:sz w:val="22"/>
+        </w:rPr>
+        <w:t xml:space="preserve">2. </w:t>
+      </w:r>
+      <w:r>
+        <w:rPr>
+          <w:rFonts w:ascii="Times New Roman" w:hAnsi="Times New Roman"/>
+          <w:sz w:val="22"/>
+        </w:rPr>
+        <w:t>Chạy chuỗi thực nghiệm Seervada Park:</w:t>
+      </w:r>
+    </w:p>
+    <w:p>
+      <w:pPr>
+        <w:spacing w:before="80" w:after="120" w:line="240" w:lineRule="auto"/>
+      </w:pPr>
+      <w:r>
+        <w:rPr>
+          <w:rFonts w:ascii="Consolas" w:hAnsi="Consolas"/>
+          <w:color w:val="1E1E1E"/>
+          <w:sz w:val="19"/>
+        </w:rPr>
+        <w:t>python scripts\run_workstream01.py --dataset seervada --artifacts-root .</w:t>
+        <w:br/>
+        <w:t>python scripts\run_workstream02.py --dataset seervada --artifacts-root .</w:t>
+        <w:br/>
+        <w:t>python scripts\run_workstream03.py --dataset seervada --artifacts-root .</w:t>
+        <w:br/>
+        <w:t>python scripts\run_workstream04.py --dataset seervada --artifacts-root .</w:t>
+        <w:br/>
+        <w:t>python scripts\run_workstream05.py --dataset seervada --artifacts-root .</w:t>
+        <w:br/>
+        <w:t>python scripts\run_workstream06.py --dataset seervada --artifacts-root .</w:t>
+        <w:br/>
+        <w:t>python scripts\make_report.py --dataset seervada --artifacts-root .</w:t>
+      </w:r>
+    </w:p>
+    <w:p>
+      <w:pPr>
+        <w:pStyle w:val="ListBullet"/>
+        <w:spacing w:before="20" w:after="60" w:line="276" w:lineRule="auto"/>
+      </w:pPr>
+      <w:r>
+        <w:rPr>
+          <w:rFonts w:ascii="Times New Roman" w:hAnsi="Times New Roman"/>
+          <w:b/>
+          <w:color w:val="2C3E50"/>
+          <w:sz w:val="22"/>
+        </w:rPr>
+        <w:t xml:space="preserve">3. </w:t>
+      </w:r>
+      <w:r>
+        <w:rPr>
+          <w:rFonts w:ascii="Times New Roman" w:hAnsi="Times New Roman"/>
+          <w:sz w:val="22"/>
+        </w:rPr>
+        <w:t>Chạy chuỗi thực nghiệm PeMS-Bay California:</w:t>
+      </w:r>
+    </w:p>
+    <w:p>
+      <w:pPr>
+        <w:spacing w:before="80" w:after="120" w:line="240" w:lineRule="auto"/>
+      </w:pPr>
+      <w:r>
+        <w:rPr>
+          <w:rFonts w:ascii="Consolas" w:hAnsi="Consolas"/>
+          <w:color w:val="1E1E1E"/>
+          <w:sz w:val="19"/>
+        </w:rPr>
+        <w:t>python scripts\run_preprocess_pems_bay.py --input-dir data\raw_pems_bay --artifacts-root .</w:t>
+        <w:br/>
+        <w:t>python scripts\run_workstream01.py --dataset pemsbay --artifacts-root .</w:t>
+        <w:br/>
+        <w:t>python scripts\run_workstream03.py --dataset pemsbay --artifacts-root .</w:t>
+        <w:br/>
+        <w:t>python scripts\run_workstream04.py --dataset pemsbay --artifacts-root .</w:t>
+        <w:br/>
+        <w:t>python scripts\run_workstream05.py --dataset pemsbay --artifacts-root .</w:t>
+        <w:br/>
+        <w:t>python scripts\run_workstream06.py --dataset pemsbay --artifacts-root .</w:t>
+        <w:br/>
+        <w:t>python scripts\make_report.py --dataset pemsbay --artifacts-root .</w:t>
+      </w:r>
+    </w:p>
+    <w:p>
+      <w:pPr>
+        <w:pStyle w:val="ListBullet"/>
+        <w:spacing w:before="20" w:after="60" w:line="276" w:lineRule="auto"/>
+      </w:pPr>
+      <w:r>
+        <w:rPr>
+          <w:rFonts w:ascii="Times New Roman" w:hAnsi="Times New Roman"/>
+          <w:b/>
+          <w:color w:val="2C3E50"/>
+          <w:sz w:val="22"/>
+        </w:rPr>
+        <w:t xml:space="preserve">4. </w:t>
+      </w:r>
+      <w:r>
+        <w:rPr>
+          <w:rFonts w:ascii="Times New Roman" w:hAnsi="Times New Roman"/>
+          <w:sz w:val="22"/>
+        </w:rPr>
+        <w:t>Kiểm thử tự động Workstream 3 (41/41 unit tests pass 100%):</w:t>
+      </w:r>
+    </w:p>
+    <w:p>
+      <w:pPr>
+        <w:spacing w:before="80" w:after="120" w:line="240" w:lineRule="auto"/>
+      </w:pPr>
+      <w:r>
+        <w:rPr>
+          <w:rFonts w:ascii="Consolas" w:hAnsi="Consolas"/>
+          <w:color w:val="1E1E1E"/>
+          <w:sz w:val="19"/>
+        </w:rPr>
+        <w:t>pytest WS/workstream03/tests/ -v</w:t>
+      </w:r>
+    </w:p>
+    <w:p>
+      <w:pPr>
+        <w:pStyle w:val="Heading2"/>
+        <w:spacing w:before="200" w:after="80"/>
+      </w:pPr>
+      <w:r>
+        <w:rPr>
+          <w:rFonts w:ascii="Times New Roman" w:hAnsi="Times New Roman"/>
+          <w:b/>
+          <w:color w:val="2980B9"/>
+          <w:sz w:val="26"/>
+        </w:rPr>
+        <w:t>5. Bảng tra cứu vị trí mã nguồn chi tiết (Code Locator)</w:t>
+      </w:r>
+    </w:p>
+    <w:p>
+      <w:pPr>
+        <w:spacing w:before="40" w:after="80" w:line="276" w:lineRule="auto"/>
+      </w:pPr>
+      <w:r>
+        <w:rPr>
+          <w:rFonts w:ascii="Times New Roman" w:hAnsi="Times New Roman"/>
+          <w:sz w:val="22"/>
+        </w:rPr>
+        <w:t>Bảng đối chiếu phục vụ công tác thanh tra, chấm điểm và tái lập thực nghiệm:</w:t>
+      </w:r>
+    </w:p>
+    <w:tbl>
+      <w:tblPr>
+        <w:tblW w:type="auto" w:w="0"/>
+        <w:jc w:val="center"/>
+        <w:tblLayout w:type="fixed"/>
+        <w:tblLook w:firstColumn="1" w:firstRow="1" w:lastColumn="0" w:lastRow="0" w:noHBand="0" w:noVBand="1" w:val="04A0"/>
+      </w:tblPr>
+      <w:tblGrid>
+        <w:gridCol w:w="1872"/>
+        <w:gridCol w:w="1872"/>
+        <w:gridCol w:w="1872"/>
+        <w:gridCol w:w="1872"/>
+        <w:gridCol w:w="1872"/>
+      </w:tblGrid>
+      <w:tr>
+        <w:tc>
+          <w:tcPr>
+            <w:tcW w:type="dxa" w:w="2160"/>
+            <w:shd w:fill="182B49"/>
           </w:tcPr>
           <w:p>
             <w:pPr>
-              <w:spacing w:before="40" w:after="40"/>
+              <w:jc w:val="center"/>
             </w:pPr>
             <w:r>
               <w:rPr>
                 <w:rFonts w:ascii="Times New Roman" w:hAnsi="Times New Roman"/>
                 <w:b/>
-                <w:color w:val="27AE60"/>
+                <w:color w:val="FFFFFF"/>
                 <w:sz w:val="20"/>
               </w:rPr>
-              <w:t>5/5 PASS (100%)</w:t>
+              <w:t>Thành phần</w:t>
+            </w:r>
+          </w:p>
+        </w:tc>
+        <w:tc>
+          <w:tcPr>
+            <w:tcW w:type="dxa" w:w="720"/>
+            <w:shd w:fill="182B49"/>
+          </w:tcPr>
+          <w:p>
+            <w:pPr>
+              <w:jc w:val="center"/>
+            </w:pPr>
+            <w:r>
+              <w:rPr>
+                <w:rFonts w:ascii="Times New Roman" w:hAnsi="Times New Roman"/>
+                <w:b/>
+                <w:color w:val="FFFFFF"/>
+                <w:sz w:val="20"/>
+              </w:rPr>
+              <w:t>WS</w:t>
+            </w:r>
+          </w:p>
+        </w:tc>
+        <w:tc>
+          <w:tcPr>
+            <w:tcW w:type="dxa" w:w="2592"/>
+            <w:shd w:fill="182B49"/>
+          </w:tcPr>
+          <w:p>
+            <w:pPr>
+              <w:jc w:val="center"/>
+            </w:pPr>
+            <w:r>
+              <w:rPr>
+                <w:rFonts w:ascii="Times New Roman" w:hAnsi="Times New Roman"/>
+                <w:b/>
+                <w:color w:val="FFFFFF"/>
+                <w:sz w:val="20"/>
+              </w:rPr>
+              <w:t>Mã nguồn chính</w:t>
+            </w:r>
+          </w:p>
+        </w:tc>
+        <w:tc>
+          <w:tcPr>
+            <w:tcW w:type="dxa" w:w="2304"/>
+            <w:shd w:fill="182B49"/>
+          </w:tcPr>
+          <w:p>
+            <w:pPr>
+              <w:jc w:val="center"/>
+            </w:pPr>
+            <w:r>
+              <w:rPr>
+                <w:rFonts w:ascii="Times New Roman" w:hAnsi="Times New Roman"/>
+                <w:b/>
+                <w:color w:val="FFFFFF"/>
+                <w:sz w:val="20"/>
+              </w:rPr>
+              <w:t>Hàm / Class cốt lõi</w:t>
+            </w:r>
+          </w:p>
+        </w:tc>
+        <w:tc>
+          <w:tcPr>
+            <w:tcW w:type="dxa" w:w="2592"/>
+            <w:shd w:fill="182B49"/>
+          </w:tcPr>
+          <w:p>
+            <w:pPr>
+              <w:jc w:val="center"/>
+            </w:pPr>
+            <w:r>
+              <w:rPr>
+                <w:rFonts w:ascii="Times New Roman" w:hAnsi="Times New Roman"/>
+                <w:b/>
+                <w:color w:val="FFFFFF"/>
+                <w:sz w:val="20"/>
+              </w:rPr>
+              <w:t>Sản phẩm đầu ra</w:t>
+            </w:r>
+          </w:p>
+        </w:tc>
+      </w:tr>
+      <w:tr>
+        <w:tc>
+          <w:tcPr>
+            <w:tcW w:type="dxa" w:w="2160"/>
+            <w:shd w:fill="FFFFFF"/>
+          </w:tcPr>
+          <w:p>
+            <w:r>
+              <w:rPr>
+                <w:rFonts w:ascii="Times New Roman" w:hAnsi="Times New Roman"/>
+                <w:color w:val="2C3E50"/>
+                <w:sz w:val="19"/>
+              </w:rPr>
+              <w:t>Dijkstra &amp; Simple Paths</w:t>
+            </w:r>
+          </w:p>
+        </w:tc>
+        <w:tc>
+          <w:tcPr>
+            <w:tcW w:type="dxa" w:w="720"/>
+            <w:shd w:fill="FFFFFF"/>
+          </w:tcPr>
+          <w:p>
+            <w:r>
+              <w:rPr>
+                <w:rFonts w:ascii="Times New Roman" w:hAnsi="Times New Roman"/>
+                <w:color w:val="2C3E50"/>
+                <w:sz w:val="19"/>
+              </w:rPr>
+              <w:t>WS1</w:t>
+            </w:r>
+          </w:p>
+        </w:tc>
+        <w:tc>
+          <w:tcPr>
+            <w:tcW w:type="dxa" w:w="2592"/>
+            <w:shd w:fill="FFFFFF"/>
+          </w:tcPr>
+          <w:p>
+            <w:r>
+              <w:rPr>
+                <w:rFonts w:ascii="Times New Roman" w:hAnsi="Times New Roman"/>
+                <w:color w:val="2C3E50"/>
+                <w:sz w:val="19"/>
+              </w:rPr>
+              <w:t>src/shortest_path/dijkstra.py</w:t>
+              <w:br/>
+              <w:t>WS/workstream01/Dijkstra.py</w:t>
+            </w:r>
+          </w:p>
+        </w:tc>
+        <w:tc>
+          <w:tcPr>
+            <w:tcW w:type="dxa" w:w="2304"/>
+            <w:shd w:fill="FFFFFF"/>
+          </w:tcPr>
+          <w:p>
+            <w:r>
+              <w:rPr>
+                <w:rFonts w:ascii="Times New Roman" w:hAnsi="Times New Roman"/>
+                <w:color w:val="2C3E50"/>
+                <w:sz w:val="19"/>
+              </w:rPr>
+              <w:t>dijkstra()</w:t>
+              <w:br/>
+              <w:t>iter_simple_paths()</w:t>
+            </w:r>
+          </w:p>
+        </w:tc>
+        <w:tc>
+          <w:tcPr>
+            <w:tcW w:type="dxa" w:w="2592"/>
+            <w:shd w:fill="FFFFFF"/>
+          </w:tcPr>
+          <w:p>
+            <w:r>
+              <w:rPr>
+                <w:rFonts w:ascii="Times New Roman" w:hAnsi="Times New Roman"/>
+                <w:color w:val="2C3E50"/>
+                <w:sz w:val="19"/>
+              </w:rPr>
+              <w:t>artifacts/seervada/paths/results_paths.csv</w:t>
+            </w:r>
+          </w:p>
+        </w:tc>
+      </w:tr>
+      <w:tr>
+        <w:tc>
+          <w:tcPr>
+            <w:tcW w:type="dxa" w:w="2160"/>
+            <w:shd w:fill="F8F9FA"/>
+          </w:tcPr>
+          <w:p>
+            <w:r>
+              <w:rPr>
+                <w:rFonts w:ascii="Times New Roman" w:hAnsi="Times New Roman"/>
+                <w:color w:val="2C3E50"/>
+                <w:sz w:val="19"/>
+              </w:rPr>
+              <w:t>RCSP (MILP 0-1 &amp; Excel)</w:t>
+            </w:r>
+          </w:p>
+        </w:tc>
+        <w:tc>
+          <w:tcPr>
+            <w:tcW w:type="dxa" w:w="720"/>
+            <w:shd w:fill="F8F9FA"/>
+          </w:tcPr>
+          <w:p>
+            <w:r>
+              <w:rPr>
+                <w:rFonts w:ascii="Times New Roman" w:hAnsi="Times New Roman"/>
+                <w:color w:val="2C3E50"/>
+                <w:sz w:val="19"/>
+              </w:rPr>
+              <w:t>WS2</w:t>
+            </w:r>
+          </w:p>
+        </w:tc>
+        <w:tc>
+          <w:tcPr>
+            <w:tcW w:type="dxa" w:w="2592"/>
+            <w:shd w:fill="F8F9FA"/>
+          </w:tcPr>
+          <w:p>
+            <w:r>
+              <w:rPr>
+                <w:rFonts w:ascii="Times New Roman" w:hAnsi="Times New Roman"/>
+                <w:color w:val="2C3E50"/>
+                <w:sz w:val="19"/>
+              </w:rPr>
+              <w:t>src/rcsp/solver.py</w:t>
+              <w:br/>
+              <w:t>WS/workstream02/rcsp_milp.py</w:t>
+            </w:r>
+          </w:p>
+        </w:tc>
+        <w:tc>
+          <w:tcPr>
+            <w:tcW w:type="dxa" w:w="2304"/>
+            <w:shd w:fill="F8F9FA"/>
+          </w:tcPr>
+          <w:p>
+            <w:r>
+              <w:rPr>
+                <w:rFonts w:ascii="Times New Roman" w:hAnsi="Times New Roman"/>
+                <w:color w:val="2C3E50"/>
+                <w:sz w:val="19"/>
+              </w:rPr>
+              <w:t>solve_rcsp_milp()</w:t>
+              <w:br/>
+              <w:t>brute_force_rcsp()</w:t>
+            </w:r>
+          </w:p>
+        </w:tc>
+        <w:tc>
+          <w:tcPr>
+            <w:tcW w:type="dxa" w:w="2592"/>
+            <w:shd w:fill="F8F9FA"/>
+          </w:tcPr>
+          <w:p>
+            <w:r>
+              <w:rPr>
+                <w:rFonts w:ascii="Times New Roman" w:hAnsi="Times New Roman"/>
+                <w:color w:val="2C3E50"/>
+                <w:sz w:val="19"/>
+              </w:rPr>
+              <w:t>artifacts/seervada/rcsp/rcsp_sensitivity.csv</w:t>
+              <w:br/>
+              <w:t>rcsp_excel_solver.xlsx</w:t>
+            </w:r>
+          </w:p>
+        </w:tc>
+      </w:tr>
+      <w:tr>
+        <w:tc>
+          <w:tcPr>
+            <w:tcW w:type="dxa" w:w="2160"/>
+            <w:shd w:fill="FFFFFF"/>
+          </w:tcPr>
+          <w:p>
+            <w:r>
+              <w:rPr>
+                <w:rFonts w:ascii="Times New Roman" w:hAnsi="Times New Roman"/>
+                <w:color w:val="2C3E50"/>
+                <w:sz w:val="19"/>
+              </w:rPr>
+              <w:t>Data Engineering &amp; Pipeline</w:t>
+            </w:r>
+          </w:p>
+        </w:tc>
+        <w:tc>
+          <w:tcPr>
+            <w:tcW w:type="dxa" w:w="720"/>
+            <w:shd w:fill="FFFFFF"/>
+          </w:tcPr>
+          <w:p>
+            <w:r>
+              <w:rPr>
+                <w:rFonts w:ascii="Times New Roman" w:hAnsi="Times New Roman"/>
+                <w:color w:val="2C3E50"/>
+                <w:sz w:val="19"/>
+              </w:rPr>
+              <w:t>WS3</w:t>
+            </w:r>
+          </w:p>
+        </w:tc>
+        <w:tc>
+          <w:tcPr>
+            <w:tcW w:type="dxa" w:w="2592"/>
+            <w:shd w:fill="FFFFFF"/>
+          </w:tcPr>
+          <w:p>
+            <w:r>
+              <w:rPr>
+                <w:rFonts w:ascii="Times New Roman" w:hAnsi="Times New Roman"/>
+                <w:color w:val="2C3E50"/>
+                <w:sz w:val="19"/>
+              </w:rPr>
+              <w:t>src/preprocess/dataset.py</w:t>
+              <w:br/>
+              <w:t>src/adapters/seervada.py</w:t>
+              <w:br/>
+              <w:t>WS/workstream03/src/*.py</w:t>
+            </w:r>
+          </w:p>
+        </w:tc>
+        <w:tc>
+          <w:tcPr>
+            <w:tcW w:type="dxa" w:w="2304"/>
+            <w:shd w:fill="FFFFFF"/>
+          </w:tcPr>
+          <w:p>
+            <w:r>
+              <w:rPr>
+                <w:rFonts w:ascii="Times New Roman" w:hAnsi="Times New Roman"/>
+                <w:color w:val="2C3E50"/>
+                <w:sz w:val="19"/>
+              </w:rPr>
+              <w:t>prepare_observation_splits()</w:t>
+              <w:br/>
+              <w:t>SeervadaAdapter</w:t>
+              <w:br/>
+              <w:t>PemsBayAdapter</w:t>
+            </w:r>
+          </w:p>
+        </w:tc>
+        <w:tc>
+          <w:tcPr>
+            <w:tcW w:type="dxa" w:w="2592"/>
+            <w:shd w:fill="FFFFFF"/>
+          </w:tcPr>
+          <w:p>
+            <w:r>
+              <w:rPr>
+                <w:rFonts w:ascii="Times New Roman" w:hAnsi="Times New Roman"/>
+                <w:color w:val="2C3E50"/>
+                <w:sz w:val="19"/>
+              </w:rPr>
+              <w:t>data/processed/seervada/</w:t>
+              <w:br/>
+              <w:t>DATA_DICTIONARY.md</w:t>
+              <w:br/>
+              <w:t>41 unit tests pass</w:t>
+            </w:r>
+          </w:p>
+        </w:tc>
+      </w:tr>
+      <w:tr>
+        <w:tc>
+          <w:tcPr>
+            <w:tcW w:type="dxa" w:w="2160"/>
+            <w:shd w:fill="F8F9FA"/>
+          </w:tcPr>
+          <w:p>
+            <w:r>
+              <w:rPr>
+                <w:rFonts w:ascii="Times New Roman" w:hAnsi="Times New Roman"/>
+                <w:color w:val="2C3E50"/>
+                <w:sz w:val="19"/>
+              </w:rPr>
+              <w:t>Baselines (Group Mean &amp; LR)</w:t>
+            </w:r>
+          </w:p>
+        </w:tc>
+        <w:tc>
+          <w:tcPr>
+            <w:tcW w:type="dxa" w:w="720"/>
+            <w:shd w:fill="F8F9FA"/>
+          </w:tcPr>
+          <w:p>
+            <w:r>
+              <w:rPr>
+                <w:rFonts w:ascii="Times New Roman" w:hAnsi="Times New Roman"/>
+                <w:color w:val="2C3E50"/>
+                <w:sz w:val="19"/>
+              </w:rPr>
+              <w:t>WS4</w:t>
+            </w:r>
+          </w:p>
+        </w:tc>
+        <w:tc>
+          <w:tcPr>
+            <w:tcW w:type="dxa" w:w="2592"/>
+            <w:shd w:fill="F8F9FA"/>
+          </w:tcPr>
+          <w:p>
+            <w:r>
+              <w:rPr>
+                <w:rFonts w:ascii="Times New Roman" w:hAnsi="Times New Roman"/>
+                <w:color w:val="2C3E50"/>
+                <w:sz w:val="19"/>
+              </w:rPr>
+              <w:t>src/models/baselines/*.py</w:t>
+              <w:br/>
+              <w:t>WS/workstream04/*.py</w:t>
+            </w:r>
+          </w:p>
+        </w:tc>
+        <w:tc>
+          <w:tcPr>
+            <w:tcW w:type="dxa" w:w="2304"/>
+            <w:shd w:fill="F8F9FA"/>
+          </w:tcPr>
+          <w:p>
+            <w:r>
+              <w:rPr>
+                <w:rFonts w:ascii="Times New Roman" w:hAnsi="Times New Roman"/>
+                <w:color w:val="2C3E50"/>
+                <w:sz w:val="19"/>
+              </w:rPr>
+              <w:t>GroupMeanModel</w:t>
+              <w:br/>
+              <w:t>LinearRegressionModel</w:t>
+            </w:r>
+          </w:p>
+        </w:tc>
+        <w:tc>
+          <w:tcPr>
+            <w:tcW w:type="dxa" w:w="2592"/>
+            <w:shd w:fill="F8F9FA"/>
+          </w:tcPr>
+          <w:p>
+            <w:r>
+              <w:rPr>
+                <w:rFonts w:ascii="Times New Roman" w:hAnsi="Times New Roman"/>
+                <w:color w:val="2C3E50"/>
+                <w:sz w:val="19"/>
+              </w:rPr>
+              <w:t>artifacts/&lt;ds&gt;/predictions/pred_*.csv</w:t>
+              <w:br/>
+              <w:t>metrics_*.csv</w:t>
+            </w:r>
+          </w:p>
+        </w:tc>
+      </w:tr>
+      <w:tr>
+        <w:tc>
+          <w:tcPr>
+            <w:tcW w:type="dxa" w:w="2160"/>
+            <w:shd w:fill="FFFFFF"/>
+          </w:tcPr>
+          <w:p>
+            <w:r>
+              <w:rPr>
+                <w:rFonts w:ascii="Times New Roman" w:hAnsi="Times New Roman"/>
+                <w:color w:val="2C3E50"/>
+                <w:sz w:val="19"/>
+              </w:rPr>
+              <w:t>Neural Network (MLP)</w:t>
+            </w:r>
+          </w:p>
+        </w:tc>
+        <w:tc>
+          <w:tcPr>
+            <w:tcW w:type="dxa" w:w="720"/>
+            <w:shd w:fill="FFFFFF"/>
+          </w:tcPr>
+          <w:p>
+            <w:r>
+              <w:rPr>
+                <w:rFonts w:ascii="Times New Roman" w:hAnsi="Times New Roman"/>
+                <w:color w:val="2C3E50"/>
+                <w:sz w:val="19"/>
+              </w:rPr>
+              <w:t>WS5</w:t>
+            </w:r>
+          </w:p>
+        </w:tc>
+        <w:tc>
+          <w:tcPr>
+            <w:tcW w:type="dxa" w:w="2592"/>
+            <w:shd w:fill="FFFFFF"/>
+          </w:tcPr>
+          <w:p>
+            <w:r>
+              <w:rPr>
+                <w:rFonts w:ascii="Times New Roman" w:hAnsi="Times New Roman"/>
+                <w:color w:val="2C3E50"/>
+                <w:sz w:val="19"/>
+              </w:rPr>
+              <w:t>src/models/nn/neural_network.py</w:t>
+              <w:br/>
+              <w:t>WS/workstream05/train_nn.py</w:t>
+            </w:r>
+          </w:p>
+        </w:tc>
+        <w:tc>
+          <w:tcPr>
+            <w:tcW w:type="dxa" w:w="2304"/>
+            <w:shd w:fill="FFFFFF"/>
+          </w:tcPr>
+          <w:p>
+            <w:r>
+              <w:rPr>
+                <w:rFonts w:ascii="Times New Roman" w:hAnsi="Times New Roman"/>
+                <w:color w:val="2C3E50"/>
+                <w:sz w:val="19"/>
+              </w:rPr>
+              <w:t>NeuralNetworkModel</w:t>
+              <w:br/>
+              <w:t>MLPRegressor</w:t>
+            </w:r>
+          </w:p>
+        </w:tc>
+        <w:tc>
+          <w:tcPr>
+            <w:tcW w:type="dxa" w:w="2592"/>
+            <w:shd w:fill="FFFFFF"/>
+          </w:tcPr>
+          <w:p>
+            <w:r>
+              <w:rPr>
+                <w:rFonts w:ascii="Times New Roman" w:hAnsi="Times New Roman"/>
+                <w:color w:val="2C3E50"/>
+                <w:sz w:val="19"/>
+              </w:rPr>
+              <w:t>artifacts/&lt;ds&gt;/predictions/pred_nn.csv</w:t>
+              <w:br/>
+              <w:t>nn_model.pkl, loss_curve.png</w:t>
+            </w:r>
+          </w:p>
+        </w:tc>
+      </w:tr>
+      <w:tr>
+        <w:tc>
+          <w:tcPr>
+            <w:tcW w:type="dxa" w:w="2160"/>
+            <w:shd w:fill="F8F9FA"/>
+          </w:tcPr>
+          <w:p>
+            <w:r>
+              <w:rPr>
+                <w:rFonts w:ascii="Times New Roman" w:hAnsi="Times New Roman"/>
+                <w:color w:val="2C3E50"/>
+                <w:sz w:val="19"/>
+              </w:rPr>
+              <w:t>Dynamic Routing &amp; Regret</w:t>
+            </w:r>
+          </w:p>
+        </w:tc>
+        <w:tc>
+          <w:tcPr>
+            <w:tcW w:type="dxa" w:w="720"/>
+            <w:shd w:fill="F8F9FA"/>
+          </w:tcPr>
+          <w:p>
+            <w:r>
+              <w:rPr>
+                <w:rFonts w:ascii="Times New Roman" w:hAnsi="Times New Roman"/>
+                <w:color w:val="2C3E50"/>
+                <w:sz w:val="19"/>
+              </w:rPr>
+              <w:t>WS6</w:t>
+            </w:r>
+          </w:p>
+        </w:tc>
+        <w:tc>
+          <w:tcPr>
+            <w:tcW w:type="dxa" w:w="2592"/>
+            <w:shd w:fill="F8F9FA"/>
+          </w:tcPr>
+          <w:p>
+            <w:r>
+              <w:rPr>
+                <w:rFonts w:ascii="Times New Roman" w:hAnsi="Times New Roman"/>
+                <w:color w:val="2C3E50"/>
+                <w:sz w:val="19"/>
+              </w:rPr>
+              <w:t>src/routing/experiment.py</w:t>
+              <w:br/>
+              <w:t>WS/workstream06/run_routing.py</w:t>
+            </w:r>
+          </w:p>
+        </w:tc>
+        <w:tc>
+          <w:tcPr>
+            <w:tcW w:type="dxa" w:w="2304"/>
+            <w:shd w:fill="F8F9FA"/>
+          </w:tcPr>
+          <w:p>
+            <w:r>
+              <w:rPr>
+                <w:rFonts w:ascii="Times New Roman" w:hAnsi="Times New Roman"/>
+                <w:color w:val="2C3E50"/>
+                <w:sz w:val="19"/>
+              </w:rPr>
+              <w:t>run_routing_experiment()</w:t>
+              <w:br/>
+              <w:t>summarize_routing_results()</w:t>
+            </w:r>
+          </w:p>
+        </w:tc>
+        <w:tc>
+          <w:tcPr>
+            <w:tcW w:type="dxa" w:w="2592"/>
+            <w:shd w:fill="F8F9FA"/>
+          </w:tcPr>
+          <w:p>
+            <w:r>
+              <w:rPr>
+                <w:rFonts w:ascii="Times New Roman" w:hAnsi="Times New Roman"/>
+                <w:color w:val="2C3E50"/>
+                <w:sz w:val="19"/>
+              </w:rPr>
+              <w:t>artifacts/&lt;ds&gt;/routing/routing_results_all.csv</w:t>
+              <w:br/>
+              <w:t>fig_route_map.png, fig_regret_*.png</w:t>
             </w:r>
           </w:p>
         </w:tc>
       </w:tr>
     </w:tbl>
+    <w:p>
+      <w:pPr>
+        <w:spacing w:after="80"/>
+      </w:pPr>
+    </w:p>
     <w:sectPr>
       <w:pgSz w:w="12240" w:h="15840"/>
       <w:pgMar w:top="1440" w:right="1440" w:bottom="1440" w:left="1440" w:header="720" w:footer="720" w:gutter="0"/>

</xml_diff>